<commit_message>
Update Singleton property in forms.
</commit_message>
<xml_diff>
--- a/Documentation/Design.docx
+++ b/Documentation/Design.docx
@@ -39,7 +39,7 @@
           <w:rPr>
             <w:noProof/>
           </w:rPr>
-          <w:t>July 17, 2026</w:t>
+          <w:t>July 22, 2026</w:t>
         </w:r>
       </w:fldSimple>
     </w:p>
@@ -1655,6 +1655,1808 @@
     </w:p>
     <w:p>
       <w:pPr>
+        <w:pStyle w:val="Body-Text"/>
+      </w:pPr>
+      <w:r>
+        <w:t>The basic idea behind the design of the tax tools is that every tax form and worksheet is series of lines, where each line is a step in the calculation of one or a few tax values. Each step calculates the next intermediate value until the last line where the final result is determined. The steps are calculated in order from the first to the last. The calculation may use values from previous steps or get values from other forms.</w:t>
+      </w:r>
+    </w:p>
+    <w:p>
+      <w:pPr>
+        <w:pStyle w:val="Body-Text"/>
+      </w:pPr>
+      <w:r>
+        <w:t>This simple, consistent design allows all tax forms to be in a similar manner. Only the implementation of the individual steps changes from one form to the</w:t>
+      </w:r>
+      <w:r>
+        <w:t xml:space="preserve"> next. Thus creating tax forms with initial tax information, executing the steps of the form, and</w:t>
+      </w:r>
+      <w:r>
+        <w:t xml:space="preserve">, and reading </w:t>
+      </w:r>
+      <w:r>
+        <w:t>information from another tax form</w:t>
+      </w:r>
+    </w:p>
+    <w:p>
+      <w:pPr>
+        <w:pStyle w:val="Body-Text"/>
+        <w:numPr>
+          <w:ilvl w:val="0"/>
+          <w:numId w:val="30"/>
+        </w:numPr>
+      </w:pPr>
+      <w:r>
+        <w:t>Using the taxpayer’s information create and initialize the tax forms.</w:t>
+      </w:r>
+    </w:p>
+    <w:p>
+      <w:pPr>
+        <w:pStyle w:val="Body-Text"/>
+        <w:numPr>
+          <w:ilvl w:val="0"/>
+          <w:numId w:val="30"/>
+        </w:numPr>
+      </w:pPr>
+      <w:r>
+        <w:t>Starting with the main form (1040), execute the steps in the forms,</w:t>
+      </w:r>
+    </w:p>
+    <w:p>
+      <w:pPr>
+        <w:pStyle w:val="Body-Text"/>
+        <w:numPr>
+          <w:ilvl w:val="0"/>
+          <w:numId w:val="30"/>
+        </w:numPr>
+      </w:pPr>
+      <w:r>
+        <w:t>Read the results or print the tax form.</w:t>
+      </w:r>
+    </w:p>
+    <w:p>
+      <w:pPr>
+        <w:pStyle w:val="Body-Text"/>
+      </w:pPr>
+      <w:r>
+        <w:t>When the steps in the main form are performed, it will read any other forms that it needs, which, in turn, will cause those forms to be calculated. So it is just a matter of entering the taxpayer’s data and calculating the first form, and the rest happens automatically. Presto, chocolate pie for desert!</w:t>
+      </w:r>
+    </w:p>
+    <w:p>
+      <w:pPr>
+        <w:pStyle w:val="Body-Text"/>
+      </w:pPr>
+      <w:r>
+        <w:t>For such a simple idea, there is a lot of code</w:t>
+      </w:r>
+      <w:r>
+        <w:t xml:space="preserve">, so the next section describes what it all is. The majority of the code files file the files that implement the tax forms that are currently supported. Each for is derived from the Form class, and it consists of two methods: </w:t>
+      </w:r>
+      <w:proofErr w:type="spellStart"/>
+      <w:proofErr w:type="gramStart"/>
+      <w:r>
+        <w:t>contructor</w:t>
+      </w:r>
+      <w:proofErr w:type="spellEnd"/>
+      <w:r>
+        <w:t>(</w:t>
+      </w:r>
+      <w:proofErr w:type="gramEnd"/>
+      <w:r>
+        <w:t xml:space="preserve">) and calculator(). The constructor just creates the </w:t>
+      </w:r>
+      <w:r>
+        <w:lastRenderedPageBreak/>
+        <w:t xml:space="preserve">lines that make up the form and the </w:t>
+      </w:r>
+      <w:proofErr w:type="gramStart"/>
+      <w:r>
+        <w:t>calculator(</w:t>
+      </w:r>
+      <w:proofErr w:type="gramEnd"/>
+      <w:r>
+        <w:t>) implements the logic that is defined by the form for each line.</w:t>
+      </w:r>
+    </w:p>
+    <w:p>
+      <w:pPr>
+        <w:pStyle w:val="Body-Text"/>
+      </w:pPr>
+      <w:r>
+        <w:t xml:space="preserve">The Forms.js module manages the forms that are in use by the tool. Any form that is created should be created by calling </w:t>
+      </w:r>
+      <w:proofErr w:type="spellStart"/>
+      <w:proofErr w:type="gramStart"/>
+      <w:r>
+        <w:t>Forms.createForm</w:t>
+      </w:r>
+      <w:proofErr w:type="spellEnd"/>
+      <w:r>
+        <w:t>(</w:t>
+      </w:r>
+      <w:proofErr w:type="gramEnd"/>
+      <w:r>
+        <w:t xml:space="preserve">), not by calling new </w:t>
+      </w:r>
+      <w:proofErr w:type="spellStart"/>
+      <w:r>
+        <w:t>FormName</w:t>
+      </w:r>
+      <w:proofErr w:type="spellEnd"/>
+      <w:r>
+        <w:t xml:space="preserve">(). This allows the Forms module to keep tract of which forms have been created and providing </w:t>
+      </w:r>
+      <w:r>
+        <w:t>convenient access to the form information.</w:t>
+      </w:r>
+    </w:p>
+    <w:p>
+      <w:pPr>
+        <w:pStyle w:val="Body-Text"/>
+      </w:pPr>
+      <w:r>
+        <w:t>Normally, a tax form must be created and calculated before values can be read from the form for use by another form.</w:t>
+      </w:r>
+      <w:r>
+        <w:t xml:space="preserve"> </w:t>
+      </w:r>
+      <w:proofErr w:type="gramStart"/>
+      <w:r>
+        <w:t>But to prevent creating and printing a lot of unused forms, if the form is just going to return 0.</w:t>
+      </w:r>
+      <w:proofErr w:type="gramEnd"/>
+      <w:r>
+        <w:t xml:space="preserve"> For example, form 1040 need to read the withholding information from lots of forms (e.g.</w:t>
+      </w:r>
+      <w:proofErr w:type="gramStart"/>
+      <w:r>
+        <w:t>,W</w:t>
+      </w:r>
+      <w:proofErr w:type="gramEnd"/>
+      <w:r>
+        <w:t xml:space="preserve">-2s, 1099s), it is not necessary to create these forms just to return 0. Any form that does not reference another form and has not already been created with initial </w:t>
+      </w:r>
+      <w:proofErr w:type="gramStart"/>
+      <w:r>
+        <w:t>values,</w:t>
+      </w:r>
+      <w:proofErr w:type="gramEnd"/>
+      <w:r>
+        <w:t xml:space="preserve"> does not need to be created when it is referenced.</w:t>
+      </w:r>
+    </w:p>
+    <w:p>
+      <w:pPr>
+        <w:pStyle w:val="Body-Text"/>
+      </w:pPr>
+      <w:r>
+        <w:t>A form does not need t</w:t>
+      </w:r>
+      <w:r>
+        <w:t>o</w:t>
+      </w:r>
+      <w:r>
+        <w:t xml:space="preserve"> be created to be accessed. If the form does not exist, the value returned will be 0. This is sufficient for any form that does not access another form such as the W-2 or 1099-INT. If a form does exist, its </w:t>
+      </w:r>
+      <w:proofErr w:type="gramStart"/>
+      <w:r>
+        <w:t>calculate(</w:t>
+      </w:r>
+      <w:proofErr w:type="gramEnd"/>
+      <w:r>
+        <w:t>) method must be called t</w:t>
+      </w:r>
+      <w:r>
+        <w:t>o make sure the data is correct (the modified flag can be used to prevent recalculating a form when it is not necessary).</w:t>
+      </w:r>
+    </w:p>
+    <w:p>
+      <w:pPr>
+        <w:pStyle w:val="Body-Text"/>
+      </w:pPr>
+      <w:r>
+        <w:t xml:space="preserve">A form can be accessed by </w:t>
+      </w:r>
+      <w:proofErr w:type="spellStart"/>
+      <w:proofErr w:type="gramStart"/>
+      <w:r>
+        <w:t>Forms.getValue</w:t>
+      </w:r>
+      <w:proofErr w:type="spellEnd"/>
+      <w:r>
+        <w:t>(</w:t>
+      </w:r>
+      <w:proofErr w:type="gramEnd"/>
+      <w:r>
+        <w:t>“</w:t>
+      </w:r>
+      <w:proofErr w:type="spellStart"/>
+      <w:r>
+        <w:t>formname</w:t>
+      </w:r>
+      <w:proofErr w:type="spellEnd"/>
+      <w:r>
+        <w:t>”, “</w:t>
+      </w:r>
+      <w:proofErr w:type="spellStart"/>
+      <w:r>
+        <w:t>lineno</w:t>
+      </w:r>
+      <w:proofErr w:type="spellEnd"/>
+      <w:r>
+        <w:t>”). This will create the form if it does not exist, and it will calculate it if it has not been calculated.</w:t>
+      </w:r>
+      <w:r>
+        <w:t xml:space="preserve"> This is how most forms are accessed, and it automatically </w:t>
+      </w:r>
+      <w:proofErr w:type="gramStart"/>
+      <w:r>
+        <w:t>create</w:t>
+      </w:r>
+      <w:proofErr w:type="gramEnd"/>
+      <w:r>
+        <w:t xml:space="preserve"> a dependency chain. If a form needs a value from another form, that form will be created and calculated before the value is returned.</w:t>
+      </w:r>
+    </w:p>
+    <w:p>
+      <w:pPr>
+        <w:pStyle w:val="Body-Text"/>
+      </w:pPr>
+      <w:r>
+        <w:t>Worksheets are associated with an immediate need for calculation,</w:t>
+      </w:r>
+      <w:r>
+        <w:t xml:space="preserve"> and their calculation may be specific to the form that needs the calculation. For example, there may be multiple schedule Cs and each one needs one needs its own calculation of the self-employment tax and SEHI deduction. Therefore, worksheets should be created by the form that needs the calculation. If you were to access the worksheet via </w:t>
+      </w:r>
+      <w:proofErr w:type="spellStart"/>
+      <w:proofErr w:type="gramStart"/>
+      <w:r>
+        <w:t>Forms.getValue</w:t>
+      </w:r>
+      <w:proofErr w:type="spellEnd"/>
+      <w:r>
+        <w:t>(</w:t>
+      </w:r>
+      <w:proofErr w:type="gramEnd"/>
+      <w:r>
+        <w:t>), it could return a value from a worksheet created for another form.</w:t>
+      </w:r>
+    </w:p>
+    <w:p>
+      <w:pPr>
+        <w:pStyle w:val="Body-Text"/>
+      </w:pPr>
+      <w:r>
+        <w:t xml:space="preserve">Therefore, worksheet constructors </w:t>
+      </w:r>
+      <w:r>
+        <w:t xml:space="preserve">should call the </w:t>
+      </w:r>
+      <w:proofErr w:type="gramStart"/>
+      <w:r>
+        <w:t>calculator(</w:t>
+      </w:r>
+      <w:proofErr w:type="gramEnd"/>
+      <w:r>
+        <w:t>) method</w:t>
+      </w:r>
+      <w:r>
+        <w:t xml:space="preserve"> directly, and the worksheet can then be accessed </w:t>
+      </w:r>
+      <w:r>
+        <w:t>as follows:</w:t>
+      </w:r>
+    </w:p>
+    <w:p>
+      <w:pPr>
+        <w:pStyle w:val="Body-Text"/>
+        <w:ind w:firstLine="720"/>
+      </w:pPr>
+      <w:proofErr w:type="gramStart"/>
+      <w:r>
+        <w:t>const</w:t>
+      </w:r>
+      <w:proofErr w:type="gramEnd"/>
+      <w:r>
+        <w:t xml:space="preserve"> value = </w:t>
+      </w:r>
+      <w:proofErr w:type="spellStart"/>
+      <w:r>
+        <w:t>Forms.createForm</w:t>
+      </w:r>
+      <w:proofErr w:type="spellEnd"/>
+      <w:r>
+        <w:t>(“Worksheet”).line(“</w:t>
+      </w:r>
+      <w:proofErr w:type="spellStart"/>
+      <w:r>
+        <w:t>lineno</w:t>
+      </w:r>
+      <w:proofErr w:type="spellEnd"/>
+      <w:r>
+        <w:t>”);</w:t>
+      </w:r>
+    </w:p>
+    <w:p>
+      <w:pPr>
+        <w:pStyle w:val="Body-Text"/>
+      </w:pPr>
+      <w:r>
+        <w:t>Or,</w:t>
+      </w:r>
+    </w:p>
+    <w:p>
+      <w:pPr>
+        <w:pStyle w:val="Body-Text"/>
+      </w:pPr>
+      <w:r>
+        <w:tab/>
+      </w:r>
+      <w:proofErr w:type="gramStart"/>
+      <w:r>
+        <w:t>const</w:t>
+      </w:r>
+      <w:proofErr w:type="gramEnd"/>
+      <w:r>
+        <w:t xml:space="preserve"> form = </w:t>
+      </w:r>
+      <w:proofErr w:type="spellStart"/>
+      <w:r>
+        <w:t>Forms.createForm</w:t>
+      </w:r>
+      <w:proofErr w:type="spellEnd"/>
+      <w:r>
+        <w:t>(“Worksheet”);</w:t>
+      </w:r>
+    </w:p>
+    <w:p>
+      <w:pPr>
+        <w:pStyle w:val="Body-Text"/>
+      </w:pPr>
+      <w:r>
+        <w:tab/>
+      </w:r>
+      <w:proofErr w:type="gramStart"/>
+      <w:r>
+        <w:t>value</w:t>
+      </w:r>
+      <w:proofErr w:type="gramEnd"/>
+      <w:r>
+        <w:t xml:space="preserve"> = </w:t>
+      </w:r>
+      <w:proofErr w:type="spellStart"/>
+      <w:r>
+        <w:t>form.line</w:t>
+      </w:r>
+      <w:proofErr w:type="spellEnd"/>
+      <w:r>
+        <w:t>(“</w:t>
+      </w:r>
+      <w:proofErr w:type="spellStart"/>
+      <w:r>
+        <w:t>lineno</w:t>
+      </w:r>
+      <w:proofErr w:type="spellEnd"/>
+      <w:r>
+        <w:t>”);</w:t>
+      </w:r>
+    </w:p>
+    <w:p>
+      <w:pPr>
+        <w:pStyle w:val="Heading2"/>
+      </w:pPr>
+      <w:proofErr w:type="spellStart"/>
+      <w:r>
+        <w:t>Form</w:t>
+      </w:r>
+      <w:proofErr w:type="spellEnd"/>
+      <w:r>
+        <w:t xml:space="preserve"> Information</w:t>
+      </w:r>
+    </w:p>
+    <w:p>
+      <w:pPr>
+        <w:pStyle w:val="Body-Text"/>
+        <w:tabs>
+          <w:tab w:val="left" w:pos="1980"/>
+          <w:tab w:val="left" w:pos="2700"/>
+          <w:tab w:val="left" w:pos="3600"/>
+          <w:tab w:val="left" w:pos="4860"/>
+        </w:tabs>
+        <w:spacing w:after="0"/>
+        <w:rPr>
+          <w:b/>
+        </w:rPr>
+      </w:pPr>
+      <w:r>
+        <w:rPr>
+          <w:b/>
+        </w:rPr>
+        <w:tab/>
+        <w:t>Calculate</w:t>
+      </w:r>
+      <w:r>
+        <w:rPr>
+          <w:b/>
+        </w:rPr>
+        <w:t xml:space="preserve"> </w:t>
+      </w:r>
+      <w:r>
+        <w:rPr>
+          <w:b/>
+        </w:rPr>
+        <w:t>Create</w:t>
+      </w:r>
+    </w:p>
+    <w:p>
+      <w:pPr>
+        <w:pStyle w:val="Body-Text"/>
+        <w:tabs>
+          <w:tab w:val="left" w:pos="1980"/>
+          <w:tab w:val="left" w:pos="2700"/>
+          <w:tab w:val="left" w:pos="3600"/>
+          <w:tab w:val="left" w:pos="4860"/>
+        </w:tabs>
+        <w:spacing w:after="0"/>
+        <w:rPr>
+          <w:b/>
+        </w:rPr>
+      </w:pPr>
+      <w:r>
+        <w:rPr>
+          <w:b/>
+        </w:rPr>
+        <w:tab/>
+        <w:t>On</w:t>
+      </w:r>
+      <w:r>
+        <w:rPr>
+          <w:b/>
+        </w:rPr>
+        <w:tab/>
+        <w:t>On</w:t>
+      </w:r>
+    </w:p>
+    <w:p>
+      <w:pPr>
+        <w:pStyle w:val="Body-Text"/>
+        <w:tabs>
+          <w:tab w:val="left" w:pos="1980"/>
+          <w:tab w:val="left" w:pos="2700"/>
+          <w:tab w:val="left" w:pos="3600"/>
+          <w:tab w:val="left" w:pos="4860"/>
+        </w:tabs>
+        <w:rPr>
+          <w:b/>
+        </w:rPr>
+      </w:pPr>
+      <w:r>
+        <w:rPr>
+          <w:b/>
+        </w:rPr>
+        <w:t>Name</w:t>
+      </w:r>
+      <w:r>
+        <w:rPr>
+          <w:b/>
+        </w:rPr>
+        <w:tab/>
+        <w:t>Demand</w:t>
+      </w:r>
+      <w:r>
+        <w:rPr>
+          <w:b/>
+        </w:rPr>
+        <w:tab/>
+        <w:t>Deman</w:t>
+      </w:r>
+      <w:r>
+        <w:rPr>
+          <w:b/>
+        </w:rPr>
+        <w:t>d</w:t>
+      </w:r>
+      <w:r>
+        <w:rPr>
+          <w:b/>
+        </w:rPr>
+        <w:tab/>
+        <w:t>Num Copies</w:t>
+      </w:r>
+      <w:r>
+        <w:rPr>
+          <w:b/>
+        </w:rPr>
+        <w:tab/>
+      </w:r>
+      <w:r>
+        <w:rPr>
+          <w:b/>
+        </w:rPr>
+        <w:t>Title</w:t>
+      </w:r>
+    </w:p>
+    <w:p>
+      <w:pPr>
+        <w:pStyle w:val="Body-Text"/>
+        <w:tabs>
+          <w:tab w:val="left" w:pos="1980"/>
+          <w:tab w:val="left" w:pos="2700"/>
+          <w:tab w:val="left" w:pos="3600"/>
+          <w:tab w:val="left" w:pos="4860"/>
+        </w:tabs>
+      </w:pPr>
+      <w:r>
+        <w:t>F1040</w:t>
+      </w:r>
+      <w:r>
+        <w:tab/>
+        <w:t>Yes</w:t>
+      </w:r>
+      <w:r>
+        <w:tab/>
+        <w:t>Yes</w:t>
+      </w:r>
+      <w:r>
+        <w:tab/>
+        <w:t>Singleton</w:t>
+      </w:r>
+    </w:p>
+    <w:p>
+      <w:pPr>
+        <w:pStyle w:val="Body-Text"/>
+        <w:tabs>
+          <w:tab w:val="left" w:pos="1980"/>
+          <w:tab w:val="left" w:pos="2700"/>
+          <w:tab w:val="left" w:pos="3600"/>
+          <w:tab w:val="left" w:pos="4860"/>
+        </w:tabs>
+      </w:pPr>
+      <w:r>
+        <w:t>F1040S1</w:t>
+      </w:r>
+      <w:r>
+        <w:tab/>
+        <w:t>Yes</w:t>
+      </w:r>
+      <w:r>
+        <w:tab/>
+        <w:t>Yes</w:t>
+      </w:r>
+      <w:r>
+        <w:tab/>
+        <w:t>Singleton</w:t>
+      </w:r>
+    </w:p>
+    <w:p>
+      <w:pPr>
+        <w:pStyle w:val="Body-Text"/>
+        <w:tabs>
+          <w:tab w:val="left" w:pos="1980"/>
+          <w:tab w:val="left" w:pos="2700"/>
+          <w:tab w:val="left" w:pos="3600"/>
+          <w:tab w:val="left" w:pos="4860"/>
+        </w:tabs>
+      </w:pPr>
+      <w:r>
+        <w:t>F1040S1A</w:t>
+      </w:r>
+      <w:r>
+        <w:tab/>
+        <w:t>Yes</w:t>
+      </w:r>
+      <w:r>
+        <w:tab/>
+        <w:t>Yes</w:t>
+      </w:r>
+      <w:r>
+        <w:tab/>
+        <w:t>Singleton</w:t>
+      </w:r>
+    </w:p>
+    <w:p>
+      <w:pPr>
+        <w:pStyle w:val="Body-Text"/>
+        <w:tabs>
+          <w:tab w:val="left" w:pos="1980"/>
+          <w:tab w:val="left" w:pos="2700"/>
+          <w:tab w:val="left" w:pos="3600"/>
+          <w:tab w:val="left" w:pos="4860"/>
+        </w:tabs>
+      </w:pPr>
+      <w:r>
+        <w:t>F1040S2</w:t>
+      </w:r>
+      <w:r>
+        <w:tab/>
+        <w:t>Yes</w:t>
+      </w:r>
+      <w:r>
+        <w:tab/>
+        <w:t>Yes</w:t>
+      </w:r>
+      <w:r>
+        <w:tab/>
+        <w:t>Singleton</w:t>
+      </w:r>
+    </w:p>
+    <w:p>
+      <w:pPr>
+        <w:pStyle w:val="Body-Text"/>
+        <w:tabs>
+          <w:tab w:val="left" w:pos="1980"/>
+          <w:tab w:val="left" w:pos="2700"/>
+          <w:tab w:val="left" w:pos="3600"/>
+          <w:tab w:val="left" w:pos="4860"/>
+        </w:tabs>
+      </w:pPr>
+      <w:r>
+        <w:t>F1040S3</w:t>
+      </w:r>
+      <w:r>
+        <w:tab/>
+        <w:t>Yes</w:t>
+      </w:r>
+      <w:r>
+        <w:tab/>
+        <w:t>Yes</w:t>
+      </w:r>
+      <w:r>
+        <w:tab/>
+        <w:t>Singleton</w:t>
+      </w:r>
+    </w:p>
+    <w:p>
+      <w:pPr>
+        <w:pStyle w:val="Body-Text"/>
+        <w:tabs>
+          <w:tab w:val="left" w:pos="1980"/>
+          <w:tab w:val="left" w:pos="2700"/>
+          <w:tab w:val="left" w:pos="3600"/>
+          <w:tab w:val="left" w:pos="4860"/>
+        </w:tabs>
+      </w:pPr>
+      <w:r>
+        <w:t>F1040SA</w:t>
+      </w:r>
+      <w:r>
+        <w:tab/>
+        <w:t>Yes</w:t>
+      </w:r>
+      <w:r>
+        <w:tab/>
+        <w:t>Yes</w:t>
+      </w:r>
+      <w:r>
+        <w:tab/>
+        <w:t>Singleton</w:t>
+      </w:r>
+    </w:p>
+    <w:p>
+      <w:pPr>
+        <w:pStyle w:val="Body-Text"/>
+        <w:tabs>
+          <w:tab w:val="left" w:pos="1980"/>
+          <w:tab w:val="left" w:pos="2700"/>
+          <w:tab w:val="left" w:pos="3600"/>
+          <w:tab w:val="left" w:pos="4860"/>
+        </w:tabs>
+      </w:pPr>
+      <w:r>
+        <w:t>F1040SB</w:t>
+      </w:r>
+      <w:r>
+        <w:tab/>
+        <w:t>No</w:t>
+      </w:r>
+      <w:r>
+        <w:tab/>
+        <w:t>Yes</w:t>
+      </w:r>
+      <w:r>
+        <w:tab/>
+        <w:t>Singleton</w:t>
+      </w:r>
+    </w:p>
+    <w:p>
+      <w:pPr>
+        <w:pStyle w:val="Body-Text"/>
+        <w:tabs>
+          <w:tab w:val="left" w:pos="1980"/>
+          <w:tab w:val="left" w:pos="2700"/>
+          <w:tab w:val="left" w:pos="3600"/>
+          <w:tab w:val="left" w:pos="4860"/>
+        </w:tabs>
+      </w:pPr>
+      <w:r>
+        <w:t>F1040SC</w:t>
+      </w:r>
+      <w:r>
+        <w:tab/>
+        <w:t>No</w:t>
+      </w:r>
+      <w:r>
+        <w:tab/>
+        <w:t>Yes</w:t>
+      </w:r>
+      <w:r>
+        <w:tab/>
+        <w:t>Not Singleton</w:t>
+      </w:r>
+    </w:p>
+    <w:p>
+      <w:pPr>
+        <w:pStyle w:val="Body-Text"/>
+        <w:tabs>
+          <w:tab w:val="left" w:pos="1980"/>
+          <w:tab w:val="left" w:pos="2700"/>
+          <w:tab w:val="left" w:pos="3600"/>
+          <w:tab w:val="left" w:pos="4860"/>
+        </w:tabs>
+      </w:pPr>
+      <w:r>
+        <w:t>F1040SD</w:t>
+      </w:r>
+      <w:r>
+        <w:tab/>
+        <w:t>No</w:t>
+      </w:r>
+      <w:r>
+        <w:tab/>
+        <w:t>Yes</w:t>
+      </w:r>
+      <w:r>
+        <w:tab/>
+        <w:t>Singleton</w:t>
+      </w:r>
+    </w:p>
+    <w:p>
+      <w:pPr>
+        <w:pStyle w:val="Body-Text"/>
+        <w:tabs>
+          <w:tab w:val="left" w:pos="1980"/>
+          <w:tab w:val="left" w:pos="2700"/>
+          <w:tab w:val="left" w:pos="3600"/>
+          <w:tab w:val="left" w:pos="4860"/>
+        </w:tabs>
+      </w:pPr>
+      <w:r>
+        <w:t>F1040SE</w:t>
+      </w:r>
+      <w:r>
+        <w:tab/>
+        <w:t>No</w:t>
+      </w:r>
+      <w:r>
+        <w:tab/>
+        <w:t>Yes</w:t>
+      </w:r>
+      <w:r>
+        <w:tab/>
+        <w:t>Singleton</w:t>
+      </w:r>
+      <w:r>
+        <w:tab/>
+      </w:r>
+      <w:r>
+        <w:t>Supplemental</w:t>
+      </w:r>
+      <w:r>
+        <w:t xml:space="preserve"> Income</w:t>
+      </w:r>
+    </w:p>
+    <w:p>
+      <w:pPr>
+        <w:pStyle w:val="Body-Text"/>
+        <w:tabs>
+          <w:tab w:val="left" w:pos="1980"/>
+          <w:tab w:val="left" w:pos="2700"/>
+          <w:tab w:val="left" w:pos="3600"/>
+          <w:tab w:val="left" w:pos="4860"/>
+        </w:tabs>
+      </w:pPr>
+      <w:r>
+        <w:t>F1040SSE</w:t>
+      </w:r>
+      <w:r>
+        <w:tab/>
+        <w:t>Yes</w:t>
+      </w:r>
+      <w:r>
+        <w:tab/>
+        <w:t>Yes</w:t>
+      </w:r>
+      <w:r>
+        <w:tab/>
+        <w:t>Singleton</w:t>
+      </w:r>
+      <w:r>
+        <w:tab/>
+        <w:t>Self-employment Tax</w:t>
+      </w:r>
+    </w:p>
+    <w:p>
+      <w:pPr>
+        <w:pStyle w:val="Body-Text"/>
+        <w:tabs>
+          <w:tab w:val="left" w:pos="1980"/>
+          <w:tab w:val="left" w:pos="2700"/>
+          <w:tab w:val="left" w:pos="3600"/>
+          <w:tab w:val="left" w:pos="4860"/>
+        </w:tabs>
+      </w:pPr>
+      <w:r>
+        <w:t>F1041</w:t>
+      </w:r>
+      <w:r>
+        <w:tab/>
+        <w:t>No</w:t>
+      </w:r>
+      <w:r>
+        <w:tab/>
+        <w:t>No</w:t>
+      </w:r>
+      <w:r>
+        <w:tab/>
+      </w:r>
+      <w:proofErr w:type="spellStart"/>
+      <w:r>
+        <w:t>Not</w:t>
+      </w:r>
+      <w:proofErr w:type="spellEnd"/>
+      <w:r>
+        <w:t xml:space="preserve"> Singleton</w:t>
+      </w:r>
+      <w:r>
+        <w:tab/>
+        <w:t>Trust</w:t>
+      </w:r>
+    </w:p>
+    <w:p>
+      <w:pPr>
+        <w:pStyle w:val="Body-Text"/>
+        <w:tabs>
+          <w:tab w:val="left" w:pos="1980"/>
+          <w:tab w:val="left" w:pos="2700"/>
+          <w:tab w:val="left" w:pos="3600"/>
+          <w:tab w:val="left" w:pos="4860"/>
+        </w:tabs>
+      </w:pPr>
+      <w:r>
+        <w:t>F1065B</w:t>
+      </w:r>
+      <w:r>
+        <w:tab/>
+        <w:t>No</w:t>
+      </w:r>
+      <w:r>
+        <w:tab/>
+        <w:t>No</w:t>
+      </w:r>
+      <w:r>
+        <w:tab/>
+      </w:r>
+      <w:proofErr w:type="spellStart"/>
+      <w:r>
+        <w:t>Not</w:t>
+      </w:r>
+      <w:proofErr w:type="spellEnd"/>
+      <w:r>
+        <w:t xml:space="preserve"> Singleton</w:t>
+      </w:r>
+    </w:p>
+    <w:p>
+      <w:pPr>
+        <w:pStyle w:val="Body-Text"/>
+        <w:tabs>
+          <w:tab w:val="left" w:pos="1980"/>
+          <w:tab w:val="left" w:pos="2700"/>
+          <w:tab w:val="left" w:pos="3600"/>
+          <w:tab w:val="left" w:pos="4860"/>
+        </w:tabs>
+      </w:pPr>
+      <w:r>
+        <w:lastRenderedPageBreak/>
+        <w:t>F1098</w:t>
+      </w:r>
+      <w:r>
+        <w:tab/>
+        <w:t>No</w:t>
+      </w:r>
+      <w:r>
+        <w:tab/>
+        <w:t>No</w:t>
+      </w:r>
+      <w:r>
+        <w:tab/>
+      </w:r>
+      <w:proofErr w:type="spellStart"/>
+      <w:r>
+        <w:t>Not</w:t>
+      </w:r>
+      <w:proofErr w:type="spellEnd"/>
+      <w:r>
+        <w:t xml:space="preserve"> Singleton</w:t>
+      </w:r>
+    </w:p>
+    <w:p>
+      <w:pPr>
+        <w:pStyle w:val="Body-Text"/>
+        <w:tabs>
+          <w:tab w:val="left" w:pos="1980"/>
+          <w:tab w:val="left" w:pos="2700"/>
+          <w:tab w:val="left" w:pos="3600"/>
+          <w:tab w:val="left" w:pos="4860"/>
+        </w:tabs>
+      </w:pPr>
+      <w:r>
+        <w:t>F1098E</w:t>
+      </w:r>
+      <w:r>
+        <w:tab/>
+        <w:t>No</w:t>
+      </w:r>
+      <w:r>
+        <w:tab/>
+        <w:t>No</w:t>
+      </w:r>
+      <w:r>
+        <w:tab/>
+      </w:r>
+      <w:proofErr w:type="spellStart"/>
+      <w:r>
+        <w:t>Not</w:t>
+      </w:r>
+      <w:proofErr w:type="spellEnd"/>
+      <w:r>
+        <w:t xml:space="preserve"> Singleton</w:t>
+      </w:r>
+    </w:p>
+    <w:p>
+      <w:pPr>
+        <w:pStyle w:val="Body-Text"/>
+        <w:tabs>
+          <w:tab w:val="left" w:pos="1980"/>
+          <w:tab w:val="left" w:pos="2700"/>
+          <w:tab w:val="left" w:pos="3600"/>
+          <w:tab w:val="left" w:pos="4860"/>
+        </w:tabs>
+      </w:pPr>
+      <w:r>
+        <w:t>F1098T</w:t>
+      </w:r>
+      <w:r>
+        <w:tab/>
+        <w:t>No</w:t>
+      </w:r>
+      <w:r>
+        <w:tab/>
+        <w:t>No</w:t>
+      </w:r>
+      <w:r>
+        <w:tab/>
+      </w:r>
+      <w:proofErr w:type="spellStart"/>
+      <w:r>
+        <w:t>Not</w:t>
+      </w:r>
+      <w:proofErr w:type="spellEnd"/>
+      <w:r>
+        <w:t xml:space="preserve"> Singleton</w:t>
+      </w:r>
+    </w:p>
+    <w:p>
+      <w:pPr>
+        <w:pStyle w:val="Body-Text"/>
+        <w:tabs>
+          <w:tab w:val="left" w:pos="1980"/>
+          <w:tab w:val="left" w:pos="2700"/>
+          <w:tab w:val="left" w:pos="3600"/>
+          <w:tab w:val="left" w:pos="4860"/>
+        </w:tabs>
+      </w:pPr>
+      <w:r>
+        <w:t>F1099B</w:t>
+      </w:r>
+      <w:r>
+        <w:tab/>
+        <w:t>No</w:t>
+      </w:r>
+      <w:r>
+        <w:tab/>
+        <w:t>No</w:t>
+      </w:r>
+      <w:r>
+        <w:tab/>
+      </w:r>
+      <w:proofErr w:type="spellStart"/>
+      <w:r>
+        <w:t>Not</w:t>
+      </w:r>
+      <w:proofErr w:type="spellEnd"/>
+      <w:r>
+        <w:t xml:space="preserve"> Singleton</w:t>
+      </w:r>
+    </w:p>
+    <w:p>
+      <w:pPr>
+        <w:pStyle w:val="Body-Text"/>
+        <w:tabs>
+          <w:tab w:val="left" w:pos="1980"/>
+          <w:tab w:val="left" w:pos="2700"/>
+          <w:tab w:val="left" w:pos="3600"/>
+          <w:tab w:val="left" w:pos="4860"/>
+        </w:tabs>
+      </w:pPr>
+      <w:r>
+        <w:t>F1099C</w:t>
+      </w:r>
+      <w:r>
+        <w:tab/>
+        <w:t>No</w:t>
+      </w:r>
+      <w:r>
+        <w:tab/>
+        <w:t>No</w:t>
+      </w:r>
+      <w:r>
+        <w:tab/>
+      </w:r>
+      <w:proofErr w:type="spellStart"/>
+      <w:r>
+        <w:t>Not</w:t>
+      </w:r>
+      <w:proofErr w:type="spellEnd"/>
+      <w:r>
+        <w:t xml:space="preserve"> Singleton</w:t>
+      </w:r>
+    </w:p>
+    <w:p>
+      <w:pPr>
+        <w:pStyle w:val="Body-Text"/>
+        <w:tabs>
+          <w:tab w:val="left" w:pos="1980"/>
+          <w:tab w:val="left" w:pos="2700"/>
+          <w:tab w:val="left" w:pos="3600"/>
+          <w:tab w:val="left" w:pos="4860"/>
+        </w:tabs>
+      </w:pPr>
+      <w:r>
+        <w:t>F1099DIV</w:t>
+      </w:r>
+      <w:r>
+        <w:tab/>
+        <w:t>No</w:t>
+      </w:r>
+      <w:r>
+        <w:tab/>
+        <w:t>No</w:t>
+      </w:r>
+      <w:r>
+        <w:tab/>
+      </w:r>
+      <w:proofErr w:type="spellStart"/>
+      <w:r>
+        <w:t>Not</w:t>
+      </w:r>
+      <w:proofErr w:type="spellEnd"/>
+      <w:r>
+        <w:t xml:space="preserve"> Singleton</w:t>
+      </w:r>
+    </w:p>
+    <w:p>
+      <w:pPr>
+        <w:pStyle w:val="Body-Text"/>
+        <w:tabs>
+          <w:tab w:val="left" w:pos="1980"/>
+          <w:tab w:val="left" w:pos="2700"/>
+          <w:tab w:val="left" w:pos="3600"/>
+          <w:tab w:val="left" w:pos="4860"/>
+        </w:tabs>
+      </w:pPr>
+      <w:r>
+        <w:t>F1099G</w:t>
+      </w:r>
+      <w:r>
+        <w:tab/>
+        <w:t>No</w:t>
+      </w:r>
+      <w:r>
+        <w:tab/>
+        <w:t>No</w:t>
+      </w:r>
+      <w:r>
+        <w:tab/>
+      </w:r>
+      <w:proofErr w:type="spellStart"/>
+      <w:r>
+        <w:t>Not</w:t>
+      </w:r>
+      <w:proofErr w:type="spellEnd"/>
+      <w:r>
+        <w:t xml:space="preserve"> Singleton</w:t>
+      </w:r>
+    </w:p>
+    <w:p>
+      <w:pPr>
+        <w:pStyle w:val="Body-Text"/>
+        <w:tabs>
+          <w:tab w:val="left" w:pos="1980"/>
+          <w:tab w:val="left" w:pos="2700"/>
+          <w:tab w:val="left" w:pos="3600"/>
+          <w:tab w:val="left" w:pos="4860"/>
+        </w:tabs>
+      </w:pPr>
+      <w:r>
+        <w:t>F1099INT</w:t>
+      </w:r>
+      <w:r>
+        <w:tab/>
+        <w:t>No</w:t>
+      </w:r>
+      <w:r>
+        <w:tab/>
+        <w:t>No</w:t>
+      </w:r>
+      <w:r>
+        <w:tab/>
+      </w:r>
+      <w:proofErr w:type="spellStart"/>
+      <w:r>
+        <w:t>Not</w:t>
+      </w:r>
+      <w:proofErr w:type="spellEnd"/>
+      <w:r>
+        <w:t xml:space="preserve"> Singleton</w:t>
+      </w:r>
+    </w:p>
+    <w:p>
+      <w:pPr>
+        <w:pStyle w:val="Body-Text"/>
+        <w:tabs>
+          <w:tab w:val="left" w:pos="1980"/>
+          <w:tab w:val="left" w:pos="2700"/>
+          <w:tab w:val="left" w:pos="3600"/>
+          <w:tab w:val="left" w:pos="4860"/>
+        </w:tabs>
+      </w:pPr>
+      <w:r>
+        <w:t>F1099K</w:t>
+      </w:r>
+      <w:r>
+        <w:tab/>
+        <w:t>No</w:t>
+      </w:r>
+      <w:r>
+        <w:tab/>
+        <w:t>No</w:t>
+      </w:r>
+      <w:r>
+        <w:tab/>
+      </w:r>
+      <w:proofErr w:type="spellStart"/>
+      <w:r>
+        <w:t>Not</w:t>
+      </w:r>
+      <w:proofErr w:type="spellEnd"/>
+      <w:r>
+        <w:t xml:space="preserve"> Singleton</w:t>
+      </w:r>
+    </w:p>
+    <w:p>
+      <w:pPr>
+        <w:pStyle w:val="Body-Text"/>
+        <w:tabs>
+          <w:tab w:val="left" w:pos="1980"/>
+          <w:tab w:val="left" w:pos="2700"/>
+          <w:tab w:val="left" w:pos="3600"/>
+          <w:tab w:val="left" w:pos="4860"/>
+        </w:tabs>
+      </w:pPr>
+      <w:r>
+        <w:t>F1099LTC</w:t>
+      </w:r>
+      <w:r>
+        <w:tab/>
+        <w:t>No</w:t>
+      </w:r>
+      <w:r>
+        <w:tab/>
+        <w:t>No</w:t>
+      </w:r>
+      <w:r>
+        <w:tab/>
+      </w:r>
+      <w:proofErr w:type="spellStart"/>
+      <w:r>
+        <w:t>Not</w:t>
+      </w:r>
+      <w:proofErr w:type="spellEnd"/>
+      <w:r>
+        <w:t xml:space="preserve"> Singleton</w:t>
+      </w:r>
+    </w:p>
+    <w:p>
+      <w:pPr>
+        <w:pStyle w:val="Body-Text"/>
+        <w:tabs>
+          <w:tab w:val="left" w:pos="1980"/>
+          <w:tab w:val="left" w:pos="2700"/>
+          <w:tab w:val="left" w:pos="3600"/>
+          <w:tab w:val="left" w:pos="4860"/>
+        </w:tabs>
+      </w:pPr>
+      <w:r>
+        <w:t>F1099MISC</w:t>
+      </w:r>
+      <w:r>
+        <w:tab/>
+        <w:t>No</w:t>
+      </w:r>
+      <w:r>
+        <w:tab/>
+        <w:t>No</w:t>
+      </w:r>
+      <w:r>
+        <w:tab/>
+      </w:r>
+      <w:proofErr w:type="spellStart"/>
+      <w:r>
+        <w:t>Not</w:t>
+      </w:r>
+      <w:proofErr w:type="spellEnd"/>
+      <w:r>
+        <w:t xml:space="preserve"> Singleton</w:t>
+      </w:r>
+    </w:p>
+    <w:p>
+      <w:pPr>
+        <w:pStyle w:val="Body-Text"/>
+        <w:tabs>
+          <w:tab w:val="left" w:pos="1980"/>
+          <w:tab w:val="left" w:pos="2700"/>
+          <w:tab w:val="left" w:pos="3600"/>
+          <w:tab w:val="left" w:pos="4860"/>
+        </w:tabs>
+      </w:pPr>
+      <w:r>
+        <w:t>F1099NEC</w:t>
+      </w:r>
+      <w:r>
+        <w:tab/>
+        <w:t>No</w:t>
+      </w:r>
+      <w:r>
+        <w:tab/>
+        <w:t>No</w:t>
+      </w:r>
+      <w:r>
+        <w:tab/>
+      </w:r>
+      <w:proofErr w:type="spellStart"/>
+      <w:r>
+        <w:t>Not</w:t>
+      </w:r>
+      <w:proofErr w:type="spellEnd"/>
+      <w:r>
+        <w:t xml:space="preserve"> Singleton</w:t>
+      </w:r>
+    </w:p>
+    <w:p>
+      <w:pPr>
+        <w:pStyle w:val="Body-Text"/>
+        <w:tabs>
+          <w:tab w:val="left" w:pos="1980"/>
+          <w:tab w:val="left" w:pos="2700"/>
+          <w:tab w:val="left" w:pos="3600"/>
+          <w:tab w:val="left" w:pos="4860"/>
+        </w:tabs>
+      </w:pPr>
+      <w:r>
+        <w:t>F1099OID</w:t>
+      </w:r>
+      <w:r>
+        <w:tab/>
+        <w:t>No</w:t>
+      </w:r>
+      <w:r>
+        <w:tab/>
+        <w:t>No</w:t>
+      </w:r>
+      <w:r>
+        <w:tab/>
+      </w:r>
+      <w:proofErr w:type="spellStart"/>
+      <w:r>
+        <w:t>Not</w:t>
+      </w:r>
+      <w:proofErr w:type="spellEnd"/>
+      <w:r>
+        <w:t xml:space="preserve"> Singleton</w:t>
+      </w:r>
+    </w:p>
+    <w:p>
+      <w:pPr>
+        <w:pStyle w:val="Body-Text"/>
+        <w:tabs>
+          <w:tab w:val="left" w:pos="1980"/>
+          <w:tab w:val="left" w:pos="2700"/>
+          <w:tab w:val="left" w:pos="3600"/>
+          <w:tab w:val="left" w:pos="4860"/>
+        </w:tabs>
+      </w:pPr>
+      <w:r>
+        <w:t>F1099R</w:t>
+      </w:r>
+      <w:r>
+        <w:tab/>
+        <w:t>No</w:t>
+      </w:r>
+      <w:r>
+        <w:tab/>
+        <w:t>No</w:t>
+      </w:r>
+      <w:r>
+        <w:tab/>
+      </w:r>
+      <w:proofErr w:type="spellStart"/>
+      <w:r>
+        <w:t>Not</w:t>
+      </w:r>
+      <w:proofErr w:type="spellEnd"/>
+      <w:r>
+        <w:t xml:space="preserve"> Singleton</w:t>
+      </w:r>
+    </w:p>
+    <w:p>
+      <w:pPr>
+        <w:pStyle w:val="Body-Text"/>
+        <w:tabs>
+          <w:tab w:val="left" w:pos="1980"/>
+          <w:tab w:val="left" w:pos="2700"/>
+          <w:tab w:val="left" w:pos="3600"/>
+          <w:tab w:val="left" w:pos="4860"/>
+        </w:tabs>
+      </w:pPr>
+      <w:r>
+        <w:t>F1099S</w:t>
+      </w:r>
+      <w:r>
+        <w:tab/>
+        <w:t>No</w:t>
+      </w:r>
+      <w:r>
+        <w:tab/>
+        <w:t>No</w:t>
+      </w:r>
+      <w:r>
+        <w:tab/>
+      </w:r>
+      <w:proofErr w:type="spellStart"/>
+      <w:r>
+        <w:t>Not</w:t>
+      </w:r>
+      <w:proofErr w:type="spellEnd"/>
+      <w:r>
+        <w:t xml:space="preserve"> Singleton</w:t>
+      </w:r>
+    </w:p>
+    <w:p>
+      <w:pPr>
+        <w:pStyle w:val="Body-Text"/>
+        <w:tabs>
+          <w:tab w:val="left" w:pos="1980"/>
+          <w:tab w:val="left" w:pos="2700"/>
+          <w:tab w:val="left" w:pos="3600"/>
+          <w:tab w:val="left" w:pos="4860"/>
+        </w:tabs>
+      </w:pPr>
+      <w:r>
+        <w:t>F1120S</w:t>
+      </w:r>
+      <w:r>
+        <w:tab/>
+        <w:t>No</w:t>
+      </w:r>
+      <w:r>
+        <w:tab/>
+        <w:t>No</w:t>
+      </w:r>
+      <w:r>
+        <w:tab/>
+      </w:r>
+      <w:proofErr w:type="spellStart"/>
+      <w:r>
+        <w:t>Not</w:t>
+      </w:r>
+      <w:proofErr w:type="spellEnd"/>
+      <w:r>
+        <w:t xml:space="preserve"> Singleton</w:t>
+      </w:r>
+    </w:p>
+    <w:p>
+      <w:pPr>
+        <w:pStyle w:val="Body-Text"/>
+        <w:tabs>
+          <w:tab w:val="left" w:pos="1980"/>
+          <w:tab w:val="left" w:pos="2700"/>
+          <w:tab w:val="left" w:pos="3600"/>
+          <w:tab w:val="left" w:pos="4860"/>
+        </w:tabs>
+      </w:pPr>
+      <w:r>
+        <w:t>F2441</w:t>
+      </w:r>
+      <w:r>
+        <w:tab/>
+        <w:t>No</w:t>
+      </w:r>
+      <w:r>
+        <w:tab/>
+        <w:t>No</w:t>
+      </w:r>
+      <w:r>
+        <w:tab/>
+        <w:t>Singleton</w:t>
+      </w:r>
+      <w:r>
+        <w:tab/>
+        <w:t>Child and Dependent Care Expenses</w:t>
+      </w:r>
+    </w:p>
+    <w:p>
+      <w:pPr>
+        <w:pStyle w:val="Body-Text"/>
+        <w:tabs>
+          <w:tab w:val="left" w:pos="1980"/>
+          <w:tab w:val="left" w:pos="2700"/>
+          <w:tab w:val="left" w:pos="3600"/>
+          <w:tab w:val="left" w:pos="4860"/>
+        </w:tabs>
+      </w:pPr>
+      <w:r>
+        <w:t>F540</w:t>
+      </w:r>
+      <w:r>
+        <w:tab/>
+        <w:t>Yes</w:t>
+      </w:r>
+      <w:r>
+        <w:tab/>
+        <w:t>Yes</w:t>
+      </w:r>
+      <w:r>
+        <w:tab/>
+        <w:t>Singleton</w:t>
+      </w:r>
+    </w:p>
+    <w:p>
+      <w:pPr>
+        <w:pStyle w:val="Body-Text"/>
+        <w:tabs>
+          <w:tab w:val="left" w:pos="1980"/>
+          <w:tab w:val="left" w:pos="2700"/>
+          <w:tab w:val="left" w:pos="3600"/>
+          <w:tab w:val="left" w:pos="4860"/>
+        </w:tabs>
+      </w:pPr>
+      <w:r>
+        <w:t>F540CA</w:t>
+      </w:r>
+      <w:r>
+        <w:tab/>
+        <w:t>Yes</w:t>
+      </w:r>
+      <w:r>
+        <w:tab/>
+        <w:t>Yes</w:t>
+      </w:r>
+      <w:r>
+        <w:tab/>
+        <w:t>Singleton</w:t>
+      </w:r>
+    </w:p>
+    <w:p>
+      <w:pPr>
+        <w:pStyle w:val="Body-Text"/>
+        <w:tabs>
+          <w:tab w:val="left" w:pos="1980"/>
+          <w:tab w:val="left" w:pos="2700"/>
+          <w:tab w:val="left" w:pos="3600"/>
+          <w:tab w:val="left" w:pos="4860"/>
+        </w:tabs>
+      </w:pPr>
+      <w:r>
+        <w:t>F6251</w:t>
+      </w:r>
+      <w:r>
+        <w:tab/>
+        <w:t>Yes</w:t>
+      </w:r>
+      <w:r>
+        <w:tab/>
+        <w:t>Yes</w:t>
+      </w:r>
+      <w:r>
+        <w:tab/>
+        <w:t>Singleton</w:t>
+      </w:r>
+      <w:r>
+        <w:tab/>
+        <w:t>AMT</w:t>
+      </w:r>
+    </w:p>
+    <w:p>
+      <w:pPr>
+        <w:pStyle w:val="Body-Text"/>
+        <w:tabs>
+          <w:tab w:val="left" w:pos="1980"/>
+          <w:tab w:val="left" w:pos="2700"/>
+          <w:tab w:val="left" w:pos="3600"/>
+          <w:tab w:val="left" w:pos="4860"/>
+        </w:tabs>
+      </w:pPr>
+      <w:r>
+        <w:t>F7206</w:t>
+      </w:r>
+      <w:r>
+        <w:tab/>
+        <w:t>Yes</w:t>
+      </w:r>
+      <w:r>
+        <w:tab/>
+        <w:t>Yes</w:t>
+      </w:r>
+      <w:r>
+        <w:tab/>
+        <w:t>Not Singleton</w:t>
+      </w:r>
+      <w:r>
+        <w:tab/>
+        <w:t>SEHI</w:t>
+      </w:r>
+    </w:p>
+    <w:p>
+      <w:pPr>
+        <w:pStyle w:val="Body-Text"/>
+        <w:tabs>
+          <w:tab w:val="left" w:pos="1980"/>
+          <w:tab w:val="left" w:pos="2700"/>
+          <w:tab w:val="left" w:pos="3600"/>
+          <w:tab w:val="left" w:pos="4860"/>
+        </w:tabs>
+      </w:pPr>
+      <w:r>
+        <w:t>W2</w:t>
+      </w:r>
+      <w:r>
+        <w:tab/>
+        <w:t>No</w:t>
+      </w:r>
+      <w:r>
+        <w:tab/>
+        <w:t>No</w:t>
+      </w:r>
+      <w:r>
+        <w:tab/>
+      </w:r>
+      <w:proofErr w:type="spellStart"/>
+      <w:r>
+        <w:t>Not</w:t>
+      </w:r>
+      <w:proofErr w:type="spellEnd"/>
+      <w:r>
+        <w:t xml:space="preserve"> Singleton</w:t>
+      </w:r>
+    </w:p>
+    <w:p>
+      <w:pPr>
+        <w:pStyle w:val="Body-Text"/>
+        <w:tabs>
+          <w:tab w:val="left" w:pos="1980"/>
+          <w:tab w:val="left" w:pos="2700"/>
+          <w:tab w:val="left" w:pos="3600"/>
+          <w:tab w:val="left" w:pos="4860"/>
+        </w:tabs>
+      </w:pPr>
+      <w:proofErr w:type="spellStart"/>
+      <w:r>
+        <w:t>IncTax</w:t>
+      </w:r>
+      <w:proofErr w:type="spellEnd"/>
+      <w:r>
+        <w:tab/>
+        <w:t>No</w:t>
+      </w:r>
+      <w:r>
+        <w:tab/>
+        <w:t>No</w:t>
+      </w:r>
+      <w:r>
+        <w:tab/>
+        <w:t>Singleton</w:t>
+      </w:r>
+    </w:p>
+    <w:p>
+      <w:pPr>
+        <w:pStyle w:val="Body-Text"/>
+        <w:tabs>
+          <w:tab w:val="left" w:pos="1980"/>
+          <w:tab w:val="left" w:pos="2700"/>
+          <w:tab w:val="left" w:pos="3600"/>
+          <w:tab w:val="left" w:pos="4860"/>
+        </w:tabs>
+      </w:pPr>
+      <w:r>
+        <w:t>Refund</w:t>
+      </w:r>
+      <w:r>
+        <w:tab/>
+        <w:t>No</w:t>
+      </w:r>
+      <w:r>
+        <w:tab/>
+        <w:t>No</w:t>
+      </w:r>
+      <w:r>
+        <w:tab/>
+        <w:t>Singleton</w:t>
+      </w:r>
+    </w:p>
+    <w:p>
+      <w:pPr>
+        <w:pStyle w:val="Body-Text"/>
+        <w:tabs>
+          <w:tab w:val="left" w:pos="1980"/>
+          <w:tab w:val="left" w:pos="2700"/>
+          <w:tab w:val="left" w:pos="3600"/>
+          <w:tab w:val="left" w:pos="4860"/>
+        </w:tabs>
+      </w:pPr>
+      <w:proofErr w:type="spellStart"/>
+      <w:r>
+        <w:t>SalesTax</w:t>
+      </w:r>
+      <w:proofErr w:type="spellEnd"/>
+      <w:r>
+        <w:tab/>
+        <w:t>No</w:t>
+      </w:r>
+      <w:r>
+        <w:tab/>
+        <w:t>No</w:t>
+      </w:r>
+      <w:r>
+        <w:tab/>
+        <w:t>Singleton</w:t>
+      </w:r>
+    </w:p>
+    <w:p>
+      <w:pPr>
+        <w:pStyle w:val="Body-Text"/>
+        <w:tabs>
+          <w:tab w:val="left" w:pos="1980"/>
+          <w:tab w:val="left" w:pos="2700"/>
+          <w:tab w:val="left" w:pos="3600"/>
+          <w:tab w:val="left" w:pos="4860"/>
+        </w:tabs>
+      </w:pPr>
+      <w:r>
+        <w:t>Simple</w:t>
+      </w:r>
+      <w:r>
+        <w:tab/>
+        <w:t>No</w:t>
+      </w:r>
+      <w:r>
+        <w:tab/>
+        <w:t>No</w:t>
+      </w:r>
+      <w:r>
+        <w:tab/>
+      </w:r>
+      <w:proofErr w:type="spellStart"/>
+      <w:r>
+        <w:t>Not</w:t>
+      </w:r>
+      <w:proofErr w:type="spellEnd"/>
+      <w:r>
+        <w:t xml:space="preserve"> Singleton</w:t>
+      </w:r>
+    </w:p>
+    <w:p>
+      <w:pPr>
+        <w:pStyle w:val="Body-Text"/>
+        <w:tabs>
+          <w:tab w:val="left" w:pos="1980"/>
+          <w:tab w:val="left" w:pos="2700"/>
+          <w:tab w:val="left" w:pos="3600"/>
+          <w:tab w:val="left" w:pos="4860"/>
+        </w:tabs>
+      </w:pPr>
+      <w:proofErr w:type="spellStart"/>
+      <w:r>
+        <w:t>SSTax</w:t>
+      </w:r>
+      <w:proofErr w:type="spellEnd"/>
+      <w:r>
+        <w:tab/>
+        <w:t>No</w:t>
+      </w:r>
+      <w:r>
+        <w:tab/>
+        <w:t>No</w:t>
+      </w:r>
+      <w:r>
+        <w:tab/>
+      </w:r>
+      <w:proofErr w:type="spellStart"/>
+      <w:r>
+        <w:t>Not</w:t>
+      </w:r>
+      <w:proofErr w:type="spellEnd"/>
+      <w:r>
+        <w:t xml:space="preserve"> Singleton</w:t>
+      </w:r>
+    </w:p>
+    <w:p>
+      <w:pPr>
+        <w:pStyle w:val="Body-Text"/>
+        <w:tabs>
+          <w:tab w:val="left" w:pos="1980"/>
+          <w:tab w:val="left" w:pos="2700"/>
+          <w:tab w:val="left" w:pos="3600"/>
+          <w:tab w:val="left" w:pos="4860"/>
+        </w:tabs>
+      </w:pPr>
+      <w:proofErr w:type="spellStart"/>
+      <w:r>
+        <w:t>CA_HiIncDeductions</w:t>
+      </w:r>
+      <w:proofErr w:type="spellEnd"/>
+      <w:r>
+        <w:tab/>
+        <w:t>No</w:t>
+      </w:r>
+      <w:r>
+        <w:tab/>
+        <w:t>No</w:t>
+      </w:r>
+      <w:r>
+        <w:tab/>
+        <w:t>Singleton</w:t>
+      </w:r>
+    </w:p>
+    <w:p>
+      <w:pPr>
+        <w:pStyle w:val="Body-Text"/>
+        <w:tabs>
+          <w:tab w:val="left" w:pos="1980"/>
+          <w:tab w:val="left" w:pos="2700"/>
+          <w:tab w:val="left" w:pos="3600"/>
+          <w:tab w:val="left" w:pos="4860"/>
+        </w:tabs>
+      </w:pPr>
+      <w:proofErr w:type="spellStart"/>
+      <w:r>
+        <w:t>CA_HiIncExemptions</w:t>
+      </w:r>
+      <w:proofErr w:type="spellEnd"/>
+      <w:r>
+        <w:tab/>
+        <w:t>No</w:t>
+      </w:r>
+      <w:r>
+        <w:tab/>
+        <w:t>No</w:t>
+      </w:r>
+      <w:r>
+        <w:tab/>
+        <w:t>Singleton</w:t>
+      </w:r>
+    </w:p>
+    <w:p>
+      <w:pPr>
         <w:pStyle w:val="Heading1"/>
       </w:pPr>
       <w:r>
@@ -1740,6 +3542,7 @@
         <w:pStyle w:val="Body-Text"/>
       </w:pPr>
       <w:r>
+        <w:lastRenderedPageBreak/>
         <w:t>TaxTable_2026.js</w:t>
       </w:r>
     </w:p>
@@ -1757,7 +3560,6 @@
       </w:pPr>
       <w:bookmarkStart w:id="2" w:name="_Toc235223960"/>
       <w:r>
-        <w:lastRenderedPageBreak/>
         <w:t>Utilities</w:t>
       </w:r>
       <w:bookmarkEnd w:id="2"/>
@@ -2227,6 +4029,7 @@
       </w:pPr>
       <w:bookmarkStart w:id="8" w:name="_Toc235223966"/>
       <w:r>
+        <w:lastRenderedPageBreak/>
         <w:t>Notes</w:t>
       </w:r>
       <w:bookmarkEnd w:id="8"/>
@@ -2252,7 +4055,6 @@
         </w:numPr>
       </w:pPr>
       <w:r>
-        <w:lastRenderedPageBreak/>
         <w:t>A for</w:t>
       </w:r>
       <w:r>
@@ -2608,6 +4410,7 @@
         </w:numPr>
       </w:pPr>
       <w:r>
+        <w:lastRenderedPageBreak/>
         <w:t>Format (number, decimal places, text, percent)</w:t>
       </w:r>
     </w:p>
@@ -2617,7 +4420,6 @@
       </w:pPr>
       <w:bookmarkStart w:id="13" w:name="_Toc235223971"/>
       <w:r>
-        <w:lastRenderedPageBreak/>
         <w:t>Algorithm</w:t>
       </w:r>
       <w:bookmarkEnd w:id="13"/>
@@ -2938,6 +4740,7 @@
         <w:pStyle w:val="List-Bullet025"/>
       </w:pPr>
       <w:r>
+        <w:lastRenderedPageBreak/>
         <w:t>Spouse:</w:t>
       </w:r>
       <w:r>
@@ -2953,7 +4756,6 @@
         <w:pStyle w:val="List-Bullet025"/>
       </w:pPr>
       <w:r>
-        <w:lastRenderedPageBreak/>
         <w:t>D</w:t>
       </w:r>
       <w:r>
@@ -4306,6 +6108,92 @@
     </w:lvl>
   </w:abstractNum>
   <w:abstractNum w:abstractNumId="7">
+    <w:nsid w:val="34253A7A"/>
+    <w:multiLevelType w:val="hybridMultilevel"/>
+    <w:tmpl w:val="532AC612"/>
+    <w:lvl w:ilvl="0" w:tplc="0409000F">
+      <w:start w:val="1"/>
+      <w:numFmt w:val="decimal"/>
+      <w:lvlText w:val="%1."/>
+      <w:lvlJc w:val="left"/>
+      <w:pPr>
+        <w:ind w:left="1440" w:hanging="360"/>
+      </w:pPr>
+    </w:lvl>
+    <w:lvl w:ilvl="1" w:tplc="04090019" w:tentative="1">
+      <w:start w:val="1"/>
+      <w:numFmt w:val="lowerLetter"/>
+      <w:lvlText w:val="%2."/>
+      <w:lvlJc w:val="left"/>
+      <w:pPr>
+        <w:ind w:left="2160" w:hanging="360"/>
+      </w:pPr>
+    </w:lvl>
+    <w:lvl w:ilvl="2" w:tplc="0409001B" w:tentative="1">
+      <w:start w:val="1"/>
+      <w:numFmt w:val="lowerRoman"/>
+      <w:lvlText w:val="%3."/>
+      <w:lvlJc w:val="right"/>
+      <w:pPr>
+        <w:ind w:left="2880" w:hanging="180"/>
+      </w:pPr>
+    </w:lvl>
+    <w:lvl w:ilvl="3" w:tplc="0409000F" w:tentative="1">
+      <w:start w:val="1"/>
+      <w:numFmt w:val="decimal"/>
+      <w:lvlText w:val="%4."/>
+      <w:lvlJc w:val="left"/>
+      <w:pPr>
+        <w:ind w:left="3600" w:hanging="360"/>
+      </w:pPr>
+    </w:lvl>
+    <w:lvl w:ilvl="4" w:tplc="04090019" w:tentative="1">
+      <w:start w:val="1"/>
+      <w:numFmt w:val="lowerLetter"/>
+      <w:lvlText w:val="%5."/>
+      <w:lvlJc w:val="left"/>
+      <w:pPr>
+        <w:ind w:left="4320" w:hanging="360"/>
+      </w:pPr>
+    </w:lvl>
+    <w:lvl w:ilvl="5" w:tplc="0409001B" w:tentative="1">
+      <w:start w:val="1"/>
+      <w:numFmt w:val="lowerRoman"/>
+      <w:lvlText w:val="%6."/>
+      <w:lvlJc w:val="right"/>
+      <w:pPr>
+        <w:ind w:left="5040" w:hanging="180"/>
+      </w:pPr>
+    </w:lvl>
+    <w:lvl w:ilvl="6" w:tplc="0409000F" w:tentative="1">
+      <w:start w:val="1"/>
+      <w:numFmt w:val="decimal"/>
+      <w:lvlText w:val="%7."/>
+      <w:lvlJc w:val="left"/>
+      <w:pPr>
+        <w:ind w:left="5760" w:hanging="360"/>
+      </w:pPr>
+    </w:lvl>
+    <w:lvl w:ilvl="7" w:tplc="04090019" w:tentative="1">
+      <w:start w:val="1"/>
+      <w:numFmt w:val="lowerLetter"/>
+      <w:lvlText w:val="%8."/>
+      <w:lvlJc w:val="left"/>
+      <w:pPr>
+        <w:ind w:left="6480" w:hanging="360"/>
+      </w:pPr>
+    </w:lvl>
+    <w:lvl w:ilvl="8" w:tplc="0409001B" w:tentative="1">
+      <w:start w:val="1"/>
+      <w:numFmt w:val="lowerRoman"/>
+      <w:lvlText w:val="%9."/>
+      <w:lvlJc w:val="right"/>
+      <w:pPr>
+        <w:ind w:left="7200" w:hanging="180"/>
+      </w:pPr>
+    </w:lvl>
+  </w:abstractNum>
+  <w:abstractNum w:abstractNumId="8">
     <w:nsid w:val="37F73326"/>
     <w:multiLevelType w:val="hybridMultilevel"/>
     <w:tmpl w:val="D6809194"/>
@@ -4418,7 +6306,7 @@
       </w:rPr>
     </w:lvl>
   </w:abstractNum>
-  <w:abstractNum w:abstractNumId="8">
+  <w:abstractNum w:abstractNumId="9">
     <w:nsid w:val="3D3B424D"/>
     <w:multiLevelType w:val="hybridMultilevel"/>
     <w:tmpl w:val="3D24DA78"/>
@@ -4532,7 +6420,7 @@
       </w:rPr>
     </w:lvl>
   </w:abstractNum>
-  <w:abstractNum w:abstractNumId="9">
+  <w:abstractNum w:abstractNumId="10">
     <w:nsid w:val="41936094"/>
     <w:multiLevelType w:val="hybridMultilevel"/>
     <w:tmpl w:val="D0107CD2"/>
@@ -4646,7 +6534,7 @@
       </w:rPr>
     </w:lvl>
   </w:abstractNum>
-  <w:abstractNum w:abstractNumId="10">
+  <w:abstractNum w:abstractNumId="11">
     <w:nsid w:val="45145E4D"/>
     <w:multiLevelType w:val="hybridMultilevel"/>
     <w:tmpl w:val="7696BC50"/>
@@ -4760,7 +6648,7 @@
       </w:rPr>
     </w:lvl>
   </w:abstractNum>
-  <w:abstractNum w:abstractNumId="11">
+  <w:abstractNum w:abstractNumId="12">
     <w:nsid w:val="53AC291B"/>
     <w:multiLevelType w:val="hybridMultilevel"/>
     <w:tmpl w:val="73DAF080"/>
@@ -4873,7 +6761,7 @@
       </w:rPr>
     </w:lvl>
   </w:abstractNum>
-  <w:abstractNum w:abstractNumId="12">
+  <w:abstractNum w:abstractNumId="13">
     <w:nsid w:val="5C90481A"/>
     <w:multiLevelType w:val="hybridMultilevel"/>
     <w:tmpl w:val="9FDAE886"/>
@@ -4986,7 +6874,7 @@
       </w:rPr>
     </w:lvl>
   </w:abstractNum>
-  <w:abstractNum w:abstractNumId="13">
+  <w:abstractNum w:abstractNumId="14">
     <w:nsid w:val="6A06332F"/>
     <w:multiLevelType w:val="hybridMultilevel"/>
     <w:tmpl w:val="7E7CD2AC"/>
@@ -5100,22 +6988,22 @@
     </w:lvl>
   </w:abstractNum>
   <w:num w:numId="1">
-    <w:abstractNumId w:val="8"/>
+    <w:abstractNumId w:val="9"/>
   </w:num>
   <w:num w:numId="2">
-    <w:abstractNumId w:val="9"/>
+    <w:abstractNumId w:val="10"/>
   </w:num>
   <w:num w:numId="3">
     <w:abstractNumId w:val="4"/>
   </w:num>
   <w:num w:numId="4">
-    <w:abstractNumId w:val="10"/>
+    <w:abstractNumId w:val="11"/>
   </w:num>
   <w:num w:numId="5">
     <w:abstractNumId w:val="1"/>
   </w:num>
   <w:num w:numId="6">
-    <w:abstractNumId w:val="7"/>
+    <w:abstractNumId w:val="8"/>
   </w:num>
   <w:num w:numId="7">
     <w:abstractNumId w:val="5"/>
@@ -5124,52 +7012,52 @@
     <w:abstractNumId w:val="6"/>
   </w:num>
   <w:num w:numId="9">
-    <w:abstractNumId w:val="8"/>
+    <w:abstractNumId w:val="9"/>
   </w:num>
   <w:num w:numId="10">
-    <w:abstractNumId w:val="8"/>
+    <w:abstractNumId w:val="9"/>
   </w:num>
   <w:num w:numId="11">
-    <w:abstractNumId w:val="10"/>
+    <w:abstractNumId w:val="11"/>
   </w:num>
   <w:num w:numId="12">
-    <w:abstractNumId w:val="10"/>
+    <w:abstractNumId w:val="11"/>
   </w:num>
   <w:num w:numId="13">
-    <w:abstractNumId w:val="10"/>
+    <w:abstractNumId w:val="11"/>
   </w:num>
   <w:num w:numId="14">
-    <w:abstractNumId w:val="10"/>
+    <w:abstractNumId w:val="11"/>
   </w:num>
   <w:num w:numId="15">
-    <w:abstractNumId w:val="10"/>
+    <w:abstractNumId w:val="11"/>
   </w:num>
   <w:num w:numId="16">
-    <w:abstractNumId w:val="10"/>
+    <w:abstractNumId w:val="11"/>
   </w:num>
   <w:num w:numId="17">
-    <w:abstractNumId w:val="10"/>
+    <w:abstractNumId w:val="11"/>
   </w:num>
   <w:num w:numId="18">
-    <w:abstractNumId w:val="10"/>
+    <w:abstractNumId w:val="11"/>
   </w:num>
   <w:num w:numId="19">
-    <w:abstractNumId w:val="10"/>
+    <w:abstractNumId w:val="11"/>
   </w:num>
   <w:num w:numId="20">
-    <w:abstractNumId w:val="8"/>
+    <w:abstractNumId w:val="9"/>
   </w:num>
   <w:num w:numId="21">
-    <w:abstractNumId w:val="8"/>
+    <w:abstractNumId w:val="9"/>
   </w:num>
   <w:num w:numId="22">
-    <w:abstractNumId w:val="10"/>
+    <w:abstractNumId w:val="11"/>
   </w:num>
   <w:num w:numId="23">
-    <w:abstractNumId w:val="10"/>
+    <w:abstractNumId w:val="11"/>
   </w:num>
   <w:num w:numId="24">
-    <w:abstractNumId w:val="11"/>
+    <w:abstractNumId w:val="12"/>
   </w:num>
   <w:num w:numId="25">
     <w:abstractNumId w:val="2"/>
@@ -5178,13 +7066,16 @@
     <w:abstractNumId w:val="0"/>
   </w:num>
   <w:num w:numId="27">
-    <w:abstractNumId w:val="12"/>
+    <w:abstractNumId w:val="13"/>
   </w:num>
   <w:num w:numId="28">
     <w:abstractNumId w:val="3"/>
   </w:num>
   <w:num w:numId="29">
-    <w:abstractNumId w:val="13"/>
+    <w:abstractNumId w:val="14"/>
+  </w:num>
+  <w:num w:numId="30">
+    <w:abstractNumId w:val="7"/>
   </w:num>
   <w:numIdMacAtCleanup w:val="4"/>
 </w:numbering>
@@ -6557,7 +8448,7 @@
 </file>
 
 <file path=customXml/itemProps1.xml><?xml version="1.0" encoding="utf-8"?>
-<ds:datastoreItem xmlns:ds="http://schemas.openxmlformats.org/officeDocument/2006/customXml" ds:itemID="{553650DC-FA77-4841-998F-6A983CB9E7AF}">
+<ds:datastoreItem xmlns:ds="http://schemas.openxmlformats.org/officeDocument/2006/customXml" ds:itemID="{79AA9529-8A99-43EF-892E-C29808FE48B2}">
   <ds:schemaRefs>
     <ds:schemaRef ds:uri="http://schemas.openxmlformats.org/officeDocument/2006/bibliography"/>
   </ds:schemaRefs>

</xml_diff>

<commit_message>
Save early changes for TaxProgram tool.
</commit_message>
<xml_diff>
--- a/Documentation/Design.docx
+++ b/Documentation/Design.docx
@@ -1719,6 +1719,100 @@
         <w:pStyle w:val="Body-Text"/>
       </w:pPr>
       <w:r>
+        <w:t>The forms are broken into steps, where each step performs a very simple task, such as:</w:t>
+      </w:r>
+    </w:p>
+    <w:p>
+      <w:pPr>
+        <w:pStyle w:val="Body-Text"/>
+        <w:numPr>
+          <w:ilvl w:val="0"/>
+          <w:numId w:val="31"/>
+        </w:numPr>
+        <w:spacing w:after="0"/>
+      </w:pPr>
+      <w:r>
+        <w:t>Getting a value from another form.</w:t>
+      </w:r>
+    </w:p>
+    <w:p>
+      <w:pPr>
+        <w:pStyle w:val="Body-Text"/>
+        <w:numPr>
+          <w:ilvl w:val="0"/>
+          <w:numId w:val="31"/>
+        </w:numPr>
+        <w:spacing w:after="0"/>
+      </w:pPr>
+      <w:r>
+        <w:t>Using values from earlier steps and performing simple arithmetic.</w:t>
+      </w:r>
+    </w:p>
+    <w:p>
+      <w:pPr>
+        <w:pStyle w:val="Body-Text"/>
+        <w:numPr>
+          <w:ilvl w:val="0"/>
+          <w:numId w:val="31"/>
+        </w:numPr>
+        <w:spacing w:after="0"/>
+      </w:pPr>
+      <w:r>
+        <w:t>Comparing values and selecting the minimum or maximum.</w:t>
+      </w:r>
+    </w:p>
+    <w:p>
+      <w:pPr>
+        <w:pStyle w:val="Body-Text"/>
+        <w:numPr>
+          <w:ilvl w:val="0"/>
+          <w:numId w:val="31"/>
+        </w:numPr>
+        <w:spacing w:after="0"/>
+      </w:pPr>
+      <w:r>
+        <w:t>Comparing values to skip steps or jump ahead.</w:t>
+      </w:r>
+    </w:p>
+    <w:p>
+      <w:pPr>
+        <w:pStyle w:val="Body-Text"/>
+        <w:numPr>
+          <w:ilvl w:val="0"/>
+          <w:numId w:val="31"/>
+        </w:numPr>
+        <w:spacing w:after="0"/>
+      </w:pPr>
+      <w:r>
+        <w:t>Introduce constant values for percentage and dollar amounts.</w:t>
+      </w:r>
+    </w:p>
+    <w:p>
+      <w:pPr>
+        <w:pStyle w:val="Body-Text"/>
+        <w:numPr>
+          <w:ilvl w:val="0"/>
+          <w:numId w:val="31"/>
+        </w:numPr>
+        <w:spacing w:after="0"/>
+      </w:pPr>
+      <w:r>
+        <w:lastRenderedPageBreak/>
+        <w:t>Final calculations may indicate transferring the result to another form.</w:t>
+      </w:r>
+    </w:p>
+    <w:p>
+      <w:pPr>
+        <w:pStyle w:val="Body-Text"/>
+        <w:spacing w:after="0"/>
+        <w:ind w:left="0"/>
+      </w:pPr>
+    </w:p>
+    <w:p>
+      <w:pPr>
+        <w:pStyle w:val="Body-Text"/>
+      </w:pPr>
+      <w:r>
         <w:t>When the steps in the main form are performed, it will read any other forms that it needs, which, in turn, will cause those forms to be calculated. So it is just a matter of entering the taxpayer’s data and calculating the first form, and the rest happens automatically. Presto, chocolate pie for desert!</w:t>
       </w:r>
     </w:p>
@@ -1743,11 +1837,7 @@
       </w:r>
       <w:proofErr w:type="gramEnd"/>
       <w:r>
-        <w:t xml:space="preserve">) and calculator(). The constructor just creates the </w:t>
-      </w:r>
-      <w:r>
-        <w:lastRenderedPageBreak/>
-        <w:t xml:space="preserve">lines that make up the form and the </w:t>
+        <w:t xml:space="preserve">) and calculator(). The constructor just creates the lines that make up the form and the </w:t>
       </w:r>
       <w:proofErr w:type="gramStart"/>
       <w:r>
@@ -2369,6 +2459,7 @@
         </w:tabs>
       </w:pPr>
       <w:r>
+        <w:lastRenderedPageBreak/>
         <w:t>F1040SC</w:t>
       </w:r>
       <w:r>
@@ -2556,7 +2647,6 @@
         </w:tabs>
       </w:pPr>
       <w:r>
-        <w:lastRenderedPageBreak/>
         <w:t>F1098</w:t>
       </w:r>
       <w:r>
@@ -3493,6 +3583,7 @@
         <w:pStyle w:val="Body-Text"/>
       </w:pPr>
       <w:r>
+        <w:lastRenderedPageBreak/>
         <w:t>TaxpayerFoms.js</w:t>
       </w:r>
     </w:p>
@@ -3542,7 +3633,6 @@
         <w:pStyle w:val="Body-Text"/>
       </w:pPr>
       <w:r>
-        <w:lastRenderedPageBreak/>
         <w:t>TaxTable_2026.js</w:t>
       </w:r>
     </w:p>
@@ -3886,6 +3976,7 @@
       </w:pPr>
       <w:proofErr w:type="spellStart"/>
       <w:r>
+        <w:lastRenderedPageBreak/>
         <w:t>tax_data</w:t>
       </w:r>
       <w:proofErr w:type="spellEnd"/>
@@ -4029,7 +4120,6 @@
       </w:pPr>
       <w:bookmarkStart w:id="8" w:name="_Toc235223966"/>
       <w:r>
-        <w:lastRenderedPageBreak/>
         <w:t>Notes</w:t>
       </w:r>
       <w:bookmarkEnd w:id="8"/>
@@ -4345,6 +4435,7 @@
         </w:numPr>
       </w:pPr>
       <w:r>
+        <w:lastRenderedPageBreak/>
         <w:t>Default value</w:t>
       </w:r>
     </w:p>
@@ -4410,7 +4501,6 @@
         </w:numPr>
       </w:pPr>
       <w:r>
-        <w:lastRenderedPageBreak/>
         <w:t>Format (number, decimal places, text, percent)</w:t>
       </w:r>
     </w:p>
@@ -4678,6 +4768,7 @@
       </w:pPr>
       <w:bookmarkStart w:id="18" w:name="_Toc235223976"/>
       <w:r>
+        <w:lastRenderedPageBreak/>
         <w:t>Taxpayer Object</w:t>
       </w:r>
       <w:bookmarkEnd w:id="18"/>
@@ -4740,7 +4831,6 @@
         <w:pStyle w:val="List-Bullet025"/>
       </w:pPr>
       <w:r>
-        <w:lastRenderedPageBreak/>
         <w:t>Spouse:</w:t>
       </w:r>
       <w:r>
@@ -5238,7 +5328,7 @@
         <w:szCs w:val="24"/>
         <w:lang w:eastAsia="en-US"/>
       </w:rPr>
-      <w:t>1</w:t>
+      <w:t>2</w:t>
     </w:r>
     <w:r>
       <w:rPr>
@@ -5846,6 +5936,119 @@
     </w:lvl>
   </w:abstractNum>
   <w:abstractNum w:abstractNumId="5">
+    <w:nsid w:val="1B042C78"/>
+    <w:multiLevelType w:val="hybridMultilevel"/>
+    <w:tmpl w:val="7F80C1C2"/>
+    <w:lvl w:ilvl="0" w:tplc="04090001">
+      <w:start w:val="1"/>
+      <w:numFmt w:val="bullet"/>
+      <w:lvlText w:val=""/>
+      <w:lvlJc w:val="left"/>
+      <w:pPr>
+        <w:ind w:left="1440" w:hanging="360"/>
+      </w:pPr>
+      <w:rPr>
+        <w:rFonts w:ascii="Symbol" w:hAnsi="Symbol" w:hint="default"/>
+      </w:rPr>
+    </w:lvl>
+    <w:lvl w:ilvl="1" w:tplc="04090003" w:tentative="1">
+      <w:start w:val="1"/>
+      <w:numFmt w:val="bullet"/>
+      <w:lvlText w:val="o"/>
+      <w:lvlJc w:val="left"/>
+      <w:pPr>
+        <w:ind w:left="2160" w:hanging="360"/>
+      </w:pPr>
+      <w:rPr>
+        <w:rFonts w:ascii="Courier New" w:hAnsi="Courier New" w:cs="Courier New" w:hint="default"/>
+      </w:rPr>
+    </w:lvl>
+    <w:lvl w:ilvl="2" w:tplc="04090005" w:tentative="1">
+      <w:start w:val="1"/>
+      <w:numFmt w:val="bullet"/>
+      <w:lvlText w:val=""/>
+      <w:lvlJc w:val="left"/>
+      <w:pPr>
+        <w:ind w:left="2880" w:hanging="360"/>
+      </w:pPr>
+      <w:rPr>
+        <w:rFonts w:ascii="Wingdings" w:hAnsi="Wingdings" w:hint="default"/>
+      </w:rPr>
+    </w:lvl>
+    <w:lvl w:ilvl="3" w:tplc="04090001" w:tentative="1">
+      <w:start w:val="1"/>
+      <w:numFmt w:val="bullet"/>
+      <w:lvlText w:val=""/>
+      <w:lvlJc w:val="left"/>
+      <w:pPr>
+        <w:ind w:left="3600" w:hanging="360"/>
+      </w:pPr>
+      <w:rPr>
+        <w:rFonts w:ascii="Symbol" w:hAnsi="Symbol" w:hint="default"/>
+      </w:rPr>
+    </w:lvl>
+    <w:lvl w:ilvl="4" w:tplc="04090003" w:tentative="1">
+      <w:start w:val="1"/>
+      <w:numFmt w:val="bullet"/>
+      <w:lvlText w:val="o"/>
+      <w:lvlJc w:val="left"/>
+      <w:pPr>
+        <w:ind w:left="4320" w:hanging="360"/>
+      </w:pPr>
+      <w:rPr>
+        <w:rFonts w:ascii="Courier New" w:hAnsi="Courier New" w:cs="Courier New" w:hint="default"/>
+      </w:rPr>
+    </w:lvl>
+    <w:lvl w:ilvl="5" w:tplc="04090005" w:tentative="1">
+      <w:start w:val="1"/>
+      <w:numFmt w:val="bullet"/>
+      <w:lvlText w:val=""/>
+      <w:lvlJc w:val="left"/>
+      <w:pPr>
+        <w:ind w:left="5040" w:hanging="360"/>
+      </w:pPr>
+      <w:rPr>
+        <w:rFonts w:ascii="Wingdings" w:hAnsi="Wingdings" w:hint="default"/>
+      </w:rPr>
+    </w:lvl>
+    <w:lvl w:ilvl="6" w:tplc="04090001" w:tentative="1">
+      <w:start w:val="1"/>
+      <w:numFmt w:val="bullet"/>
+      <w:lvlText w:val=""/>
+      <w:lvlJc w:val="left"/>
+      <w:pPr>
+        <w:ind w:left="5760" w:hanging="360"/>
+      </w:pPr>
+      <w:rPr>
+        <w:rFonts w:ascii="Symbol" w:hAnsi="Symbol" w:hint="default"/>
+      </w:rPr>
+    </w:lvl>
+    <w:lvl w:ilvl="7" w:tplc="04090003" w:tentative="1">
+      <w:start w:val="1"/>
+      <w:numFmt w:val="bullet"/>
+      <w:lvlText w:val="o"/>
+      <w:lvlJc w:val="left"/>
+      <w:pPr>
+        <w:ind w:left="6480" w:hanging="360"/>
+      </w:pPr>
+      <w:rPr>
+        <w:rFonts w:ascii="Courier New" w:hAnsi="Courier New" w:cs="Courier New" w:hint="default"/>
+      </w:rPr>
+    </w:lvl>
+    <w:lvl w:ilvl="8" w:tplc="04090005" w:tentative="1">
+      <w:start w:val="1"/>
+      <w:numFmt w:val="bullet"/>
+      <w:lvlText w:val=""/>
+      <w:lvlJc w:val="left"/>
+      <w:pPr>
+        <w:ind w:left="7200" w:hanging="360"/>
+      </w:pPr>
+      <w:rPr>
+        <w:rFonts w:ascii="Wingdings" w:hAnsi="Wingdings" w:hint="default"/>
+      </w:rPr>
+    </w:lvl>
+  </w:abstractNum>
+  <w:abstractNum w:abstractNumId="6">
     <w:nsid w:val="1BD037C1"/>
     <w:multiLevelType w:val="multilevel"/>
     <w:tmpl w:val="27AAF726"/>
@@ -5994,7 +6197,7 @@
       </w:rPr>
     </w:lvl>
   </w:abstractNum>
-  <w:abstractNum w:abstractNumId="6">
+  <w:abstractNum w:abstractNumId="7">
     <w:nsid w:val="2F6D352C"/>
     <w:multiLevelType w:val="hybridMultilevel"/>
     <w:tmpl w:val="4A6A32C2"/>
@@ -6107,7 +6310,7 @@
       </w:rPr>
     </w:lvl>
   </w:abstractNum>
-  <w:abstractNum w:abstractNumId="7">
+  <w:abstractNum w:abstractNumId="8">
     <w:nsid w:val="34253A7A"/>
     <w:multiLevelType w:val="hybridMultilevel"/>
     <w:tmpl w:val="532AC612"/>
@@ -6193,7 +6396,7 @@
       </w:pPr>
     </w:lvl>
   </w:abstractNum>
-  <w:abstractNum w:abstractNumId="8">
+  <w:abstractNum w:abstractNumId="9">
     <w:nsid w:val="37F73326"/>
     <w:multiLevelType w:val="hybridMultilevel"/>
     <w:tmpl w:val="D6809194"/>
@@ -6306,7 +6509,7 @@
       </w:rPr>
     </w:lvl>
   </w:abstractNum>
-  <w:abstractNum w:abstractNumId="9">
+  <w:abstractNum w:abstractNumId="10">
     <w:nsid w:val="3D3B424D"/>
     <w:multiLevelType w:val="hybridMultilevel"/>
     <w:tmpl w:val="3D24DA78"/>
@@ -6420,7 +6623,7 @@
       </w:rPr>
     </w:lvl>
   </w:abstractNum>
-  <w:abstractNum w:abstractNumId="10">
+  <w:abstractNum w:abstractNumId="11">
     <w:nsid w:val="41936094"/>
     <w:multiLevelType w:val="hybridMultilevel"/>
     <w:tmpl w:val="D0107CD2"/>
@@ -6534,7 +6737,7 @@
       </w:rPr>
     </w:lvl>
   </w:abstractNum>
-  <w:abstractNum w:abstractNumId="11">
+  <w:abstractNum w:abstractNumId="12">
     <w:nsid w:val="45145E4D"/>
     <w:multiLevelType w:val="hybridMultilevel"/>
     <w:tmpl w:val="7696BC50"/>
@@ -6648,7 +6851,7 @@
       </w:rPr>
     </w:lvl>
   </w:abstractNum>
-  <w:abstractNum w:abstractNumId="12">
+  <w:abstractNum w:abstractNumId="13">
     <w:nsid w:val="53AC291B"/>
     <w:multiLevelType w:val="hybridMultilevel"/>
     <w:tmpl w:val="73DAF080"/>
@@ -6761,7 +6964,7 @@
       </w:rPr>
     </w:lvl>
   </w:abstractNum>
-  <w:abstractNum w:abstractNumId="13">
+  <w:abstractNum w:abstractNumId="14">
     <w:nsid w:val="5C90481A"/>
     <w:multiLevelType w:val="hybridMultilevel"/>
     <w:tmpl w:val="9FDAE886"/>
@@ -6874,7 +7077,7 @@
       </w:rPr>
     </w:lvl>
   </w:abstractNum>
-  <w:abstractNum w:abstractNumId="14">
+  <w:abstractNum w:abstractNumId="15">
     <w:nsid w:val="6A06332F"/>
     <w:multiLevelType w:val="hybridMultilevel"/>
     <w:tmpl w:val="7E7CD2AC"/>
@@ -6988,76 +7191,76 @@
     </w:lvl>
   </w:abstractNum>
   <w:num w:numId="1">
-    <w:abstractNumId w:val="9"/>
+    <w:abstractNumId w:val="10"/>
   </w:num>
   <w:num w:numId="2">
-    <w:abstractNumId w:val="10"/>
+    <w:abstractNumId w:val="11"/>
   </w:num>
   <w:num w:numId="3">
     <w:abstractNumId w:val="4"/>
   </w:num>
   <w:num w:numId="4">
-    <w:abstractNumId w:val="11"/>
+    <w:abstractNumId w:val="12"/>
   </w:num>
   <w:num w:numId="5">
     <w:abstractNumId w:val="1"/>
   </w:num>
   <w:num w:numId="6">
-    <w:abstractNumId w:val="8"/>
+    <w:abstractNumId w:val="9"/>
   </w:num>
   <w:num w:numId="7">
-    <w:abstractNumId w:val="5"/>
+    <w:abstractNumId w:val="6"/>
   </w:num>
   <w:num w:numId="8">
-    <w:abstractNumId w:val="6"/>
+    <w:abstractNumId w:val="7"/>
   </w:num>
   <w:num w:numId="9">
-    <w:abstractNumId w:val="9"/>
+    <w:abstractNumId w:val="10"/>
   </w:num>
   <w:num w:numId="10">
-    <w:abstractNumId w:val="9"/>
+    <w:abstractNumId w:val="10"/>
   </w:num>
   <w:num w:numId="11">
-    <w:abstractNumId w:val="11"/>
+    <w:abstractNumId w:val="12"/>
   </w:num>
   <w:num w:numId="12">
-    <w:abstractNumId w:val="11"/>
+    <w:abstractNumId w:val="12"/>
   </w:num>
   <w:num w:numId="13">
-    <w:abstractNumId w:val="11"/>
+    <w:abstractNumId w:val="12"/>
   </w:num>
   <w:num w:numId="14">
-    <w:abstractNumId w:val="11"/>
+    <w:abstractNumId w:val="12"/>
   </w:num>
   <w:num w:numId="15">
-    <w:abstractNumId w:val="11"/>
+    <w:abstractNumId w:val="12"/>
   </w:num>
   <w:num w:numId="16">
-    <w:abstractNumId w:val="11"/>
+    <w:abstractNumId w:val="12"/>
   </w:num>
   <w:num w:numId="17">
-    <w:abstractNumId w:val="11"/>
+    <w:abstractNumId w:val="12"/>
   </w:num>
   <w:num w:numId="18">
-    <w:abstractNumId w:val="11"/>
+    <w:abstractNumId w:val="12"/>
   </w:num>
   <w:num w:numId="19">
-    <w:abstractNumId w:val="11"/>
+    <w:abstractNumId w:val="12"/>
   </w:num>
   <w:num w:numId="20">
-    <w:abstractNumId w:val="9"/>
+    <w:abstractNumId w:val="10"/>
   </w:num>
   <w:num w:numId="21">
-    <w:abstractNumId w:val="9"/>
+    <w:abstractNumId w:val="10"/>
   </w:num>
   <w:num w:numId="22">
-    <w:abstractNumId w:val="11"/>
+    <w:abstractNumId w:val="12"/>
   </w:num>
   <w:num w:numId="23">
-    <w:abstractNumId w:val="11"/>
+    <w:abstractNumId w:val="12"/>
   </w:num>
   <w:num w:numId="24">
-    <w:abstractNumId w:val="12"/>
+    <w:abstractNumId w:val="13"/>
   </w:num>
   <w:num w:numId="25">
     <w:abstractNumId w:val="2"/>
@@ -7066,16 +7269,19 @@
     <w:abstractNumId w:val="0"/>
   </w:num>
   <w:num w:numId="27">
-    <w:abstractNumId w:val="13"/>
+    <w:abstractNumId w:val="14"/>
   </w:num>
   <w:num w:numId="28">
     <w:abstractNumId w:val="3"/>
   </w:num>
   <w:num w:numId="29">
-    <w:abstractNumId w:val="14"/>
+    <w:abstractNumId w:val="15"/>
   </w:num>
   <w:num w:numId="30">
-    <w:abstractNumId w:val="7"/>
+    <w:abstractNumId w:val="8"/>
+  </w:num>
+  <w:num w:numId="31">
+    <w:abstractNumId w:val="5"/>
   </w:num>
   <w:numIdMacAtCleanup w:val="4"/>
 </w:numbering>
@@ -8448,7 +8654,7 @@
 </file>
 
 <file path=customXml/itemProps1.xml><?xml version="1.0" encoding="utf-8"?>
-<ds:datastoreItem xmlns:ds="http://schemas.openxmlformats.org/officeDocument/2006/customXml" ds:itemID="{79AA9529-8A99-43EF-892E-C29808FE48B2}">
+<ds:datastoreItem xmlns:ds="http://schemas.openxmlformats.org/officeDocument/2006/customXml" ds:itemID="{7C989AF5-7A11-4FD2-982F-999622D2B8F5}">
   <ds:schemaRefs>
     <ds:schemaRef ds:uri="http://schemas.openxmlformats.org/officeDocument/2006/bibliography"/>
   </ds:schemaRefs>

</xml_diff>

<commit_message>
Make Forms.addForm() local to Forms instead of being called from all the constructors.
</commit_message>
<xml_diff>
--- a/Documentation/Design.docx
+++ b/Documentation/Design.docx
@@ -39,7 +39,7 @@
           <w:rPr>
             <w:noProof/>
           </w:rPr>
-          <w:t>July 22, 2026</w:t>
+          <w:t>July 23, 2026</w:t>
         </w:r>
       </w:fldSimple>
     </w:p>
@@ -2135,6 +2135,95 @@
       <w:pPr>
         <w:pStyle w:val="Heading2"/>
       </w:pPr>
+      <w:r>
+        <w:t>Data Format</w:t>
+      </w:r>
+    </w:p>
+    <w:p>
+      <w:pPr>
+        <w:pStyle w:val="Body-Text"/>
+      </w:pPr>
+      <w:r>
+        <w:t>Tax information is in three format or stages. In the first format, the information is displayed on a web page. It starts as empty fields where the user enters tax data. In some tools, the fields on the web page may resemble a tax form, or for other tools, it may only be a few lines of input that to not resemble a tax form at all. At this stage the information is fields on a web page</w:t>
+      </w:r>
+    </w:p>
+    <w:p>
+      <w:pPr>
+        <w:pStyle w:val="Body-Text"/>
+      </w:pPr>
+      <w:r>
+        <w:t xml:space="preserve">When the tool performs its calculation, the information is copied from the web page and translated to the corresponding field on some tax form. Sometimes the information is copied directly to a field </w:t>
+      </w:r>
+      <w:proofErr w:type="spellStart"/>
+      <w:r>
+        <w:t>ona</w:t>
+      </w:r>
+      <w:proofErr w:type="spellEnd"/>
+      <w:r>
+        <w:t xml:space="preserve"> tax form and other times it may be combined with other information or manipulated in some way to come </w:t>
+      </w:r>
+      <w:proofErr w:type="spellStart"/>
+      <w:r>
+        <w:t>yup</w:t>
+      </w:r>
+      <w:proofErr w:type="spellEnd"/>
+      <w:r>
+        <w:t xml:space="preserve"> with the information to enter in a tax form. The result is this phase </w:t>
+      </w:r>
+      <w:r>
+        <w:t>translates</w:t>
+      </w:r>
+      <w:r>
+        <w:t xml:space="preserve"> the fields on </w:t>
+      </w:r>
+      <w:r>
+        <w:t xml:space="preserve">the </w:t>
+      </w:r>
+      <w:r>
+        <w:t xml:space="preserve">web page to </w:t>
+      </w:r>
+      <w:r>
+        <w:t xml:space="preserve">sets of </w:t>
+      </w:r>
+      <w:r>
+        <w:t>tax form, line number</w:t>
+      </w:r>
+      <w:r>
+        <w:t>,</w:t>
+      </w:r>
+      <w:r>
+        <w:t xml:space="preserve"> and a value.</w:t>
+      </w:r>
+    </w:p>
+    <w:p>
+      <w:pPr>
+        <w:pStyle w:val="Body-Text"/>
+      </w:pPr>
+      <w:r>
+        <w:t>One tax data object is created, but it stores an entry for each type of form that is needed, and for each type of form that is needed, it may have an entry for each instance of that form. The line number and value of each entry from the web page is stored with its instance of the tax form.</w:t>
+      </w:r>
+    </w:p>
+    <w:p>
+      <w:pPr>
+        <w:pStyle w:val="Body-Text"/>
+      </w:pPr>
+      <w:r>
+        <w:lastRenderedPageBreak/>
+        <w:t>After all the information is collected into values to be entered on lines in a tax form, the tax forms are created. When the tax form is created additional checking may be performed</w:t>
+      </w:r>
+      <w:r>
+        <w:t>.</w:t>
+      </w:r>
+    </w:p>
+    <w:p>
+      <w:pPr>
+        <w:pStyle w:val="Body-Text"/>
+      </w:pPr>
+    </w:p>
+    <w:p>
+      <w:pPr>
+        <w:pStyle w:val="Heading2"/>
+      </w:pPr>
       <w:proofErr w:type="spellStart"/>
       <w:r>
         <w:t>Form</w:t>
@@ -2459,7 +2548,6 @@
         </w:tabs>
       </w:pPr>
       <w:r>
-        <w:lastRenderedPageBreak/>
         <w:t>F1040SC</w:t>
       </w:r>
       <w:r>
@@ -3287,6 +3375,7 @@
         </w:tabs>
       </w:pPr>
       <w:r>
+        <w:lastRenderedPageBreak/>
         <w:t>F7206</w:t>
       </w:r>
       <w:r>
@@ -3583,7 +3672,6 @@
         <w:pStyle w:val="Body-Text"/>
       </w:pPr>
       <w:r>
-        <w:lastRenderedPageBreak/>
         <w:t>TaxpayerFoms.js</w:t>
       </w:r>
     </w:p>
@@ -3770,6 +3858,7 @@
       </w:pPr>
       <w:proofErr w:type="spellStart"/>
       <w:r>
+        <w:lastRenderedPageBreak/>
         <w:t>SalesTax</w:t>
       </w:r>
       <w:proofErr w:type="spellEnd"/>
@@ -3976,7 +4065,6 @@
       </w:pPr>
       <w:proofErr w:type="spellStart"/>
       <w:r>
-        <w:lastRenderedPageBreak/>
         <w:t>tax_data</w:t>
       </w:r>
       <w:proofErr w:type="spellEnd"/>
@@ -4294,6 +4382,7 @@
       </w:pPr>
       <w:bookmarkStart w:id="10" w:name="_Toc235223968"/>
       <w:r>
+        <w:lastRenderedPageBreak/>
         <w:t>Properties</w:t>
       </w:r>
       <w:bookmarkEnd w:id="10"/>
@@ -4435,7 +4524,6 @@
         </w:numPr>
       </w:pPr>
       <w:r>
-        <w:lastRenderedPageBreak/>
         <w:t>Default value</w:t>
       </w:r>
     </w:p>
@@ -4667,6 +4755,7 @@
         <w:pStyle w:val="List-Bullet025"/>
       </w:pPr>
       <w:r>
+        <w:lastRenderedPageBreak/>
         <w:t>1040sc</w:t>
       </w:r>
     </w:p>
@@ -4768,7 +4857,6 @@
       </w:pPr>
       <w:bookmarkStart w:id="18" w:name="_Toc235223976"/>
       <w:r>
-        <w:lastRenderedPageBreak/>
         <w:t>Taxpayer Object</w:t>
       </w:r>
       <w:bookmarkEnd w:id="18"/>
@@ -5067,6 +5155,7 @@
         <w:ind w:left="1800"/>
       </w:pPr>
       <w:r>
+        <w:lastRenderedPageBreak/>
         <w:t>Inputs that can be set,</w:t>
       </w:r>
     </w:p>
@@ -5328,7 +5417,7 @@
         <w:szCs w:val="24"/>
         <w:lang w:eastAsia="en-US"/>
       </w:rPr>
-      <w:t>2</w:t>
+      <w:t>3</w:t>
     </w:r>
     <w:r>
       <w:rPr>
@@ -8654,7 +8743,7 @@
 </file>
 
 <file path=customXml/itemProps1.xml><?xml version="1.0" encoding="utf-8"?>
-<ds:datastoreItem xmlns:ds="http://schemas.openxmlformats.org/officeDocument/2006/customXml" ds:itemID="{7C989AF5-7A11-4FD2-982F-999622D2B8F5}">
+<ds:datastoreItem xmlns:ds="http://schemas.openxmlformats.org/officeDocument/2006/customXml" ds:itemID="{CC26C25A-7685-4AE2-B334-26E2785C4CDD}">
   <ds:schemaRefs>
     <ds:schemaRef ds:uri="http://schemas.openxmlformats.org/officeDocument/2006/bibliography"/>
   </ds:schemaRefs>

</xml_diff>

<commit_message>
Changes user_value to set user_value, and added Debug.verify().
</commit_message>
<xml_diff>
--- a/Documentation/Design.docx
+++ b/Documentation/Design.docx
@@ -39,7 +39,7 @@
           <w:rPr>
             <w:noProof/>
           </w:rPr>
-          <w:t>July 23, 2026</w:t>
+          <w:t>July 28, 2026</w:t>
         </w:r>
       </w:fldSimple>
     </w:p>
@@ -1658,18 +1658,191 @@
         <w:pStyle w:val="Body-Text"/>
       </w:pPr>
       <w:r>
-        <w:t>The basic idea behind the design of the tax tools is that every tax form and worksheet is series of lines, where each line is a step in the calculation of one or a few tax values. Each step calculates the next intermediate value until the last line where the final result is determined. The steps are calculated in order from the first to the last. The calculation may use values from previous steps or get values from other forms.</w:t>
-      </w:r>
-    </w:p>
-    <w:p>
-      <w:pPr>
-        <w:pStyle w:val="Body-Text"/>
-      </w:pPr>
-      <w:r>
-        <w:t>This simple, consistent design allows all tax forms to be in a similar manner. Only the implementation of the individual steps changes from one form to the</w:t>
-      </w:r>
-      <w:r>
-        <w:t xml:space="preserve"> next. Thus creating tax forms with initial tax information, executing the steps of the form, and</w:t>
+        <w:t xml:space="preserve">The basic idea behind the design of the tax tools is that every tax form is series of lines, where each line is a step in the calculation of one or a few tax values. </w:t>
+      </w:r>
+      <w:r>
+        <w:t>Each line consists of a line number, a description, and a value. The description tells how to calculate the value for that line.</w:t>
+      </w:r>
+    </w:p>
+    <w:p>
+      <w:pPr>
+        <w:pStyle w:val="Body-Text"/>
+      </w:pPr>
+      <w:r>
+        <w:t>The calculation for any individual line is always consists of simple operations, such as:</w:t>
+      </w:r>
+    </w:p>
+    <w:p>
+      <w:pPr>
+        <w:pStyle w:val="Body-Text"/>
+        <w:numPr>
+          <w:ilvl w:val="0"/>
+          <w:numId w:val="32"/>
+        </w:numPr>
+        <w:spacing w:after="0"/>
+      </w:pPr>
+      <w:r>
+        <w:t>Getting a value from another line.</w:t>
+      </w:r>
+    </w:p>
+    <w:p>
+      <w:pPr>
+        <w:pStyle w:val="Body-Text"/>
+        <w:numPr>
+          <w:ilvl w:val="0"/>
+          <w:numId w:val="32"/>
+        </w:numPr>
+        <w:spacing w:after="0"/>
+      </w:pPr>
+      <w:r>
+        <w:t>Performing simple arithmetic</w:t>
+      </w:r>
+    </w:p>
+    <w:p>
+      <w:pPr>
+        <w:pStyle w:val="Body-Text"/>
+        <w:numPr>
+          <w:ilvl w:val="0"/>
+          <w:numId w:val="32"/>
+        </w:numPr>
+        <w:spacing w:after="0"/>
+      </w:pPr>
+      <w:r>
+        <w:t>Selecting the minimum or maximum value</w:t>
+      </w:r>
+    </w:p>
+    <w:p>
+      <w:pPr>
+        <w:pStyle w:val="Body-Text"/>
+        <w:numPr>
+          <w:ilvl w:val="0"/>
+          <w:numId w:val="32"/>
+        </w:numPr>
+        <w:spacing w:after="0"/>
+      </w:pPr>
+      <w:r>
+        <w:t>Skipping steps</w:t>
+      </w:r>
+    </w:p>
+    <w:p>
+      <w:pPr>
+        <w:pStyle w:val="Body-Text"/>
+        <w:numPr>
+          <w:ilvl w:val="0"/>
+          <w:numId w:val="32"/>
+        </w:numPr>
+        <w:spacing w:after="0"/>
+      </w:pPr>
+      <w:r>
+        <w:t>Or, getting a value from a line in another form.</w:t>
+      </w:r>
+    </w:p>
+    <w:p>
+      <w:pPr>
+        <w:pStyle w:val="BlankLine"/>
+      </w:pPr>
+    </w:p>
+    <w:p>
+      <w:pPr>
+        <w:pStyle w:val="Body-Text"/>
+      </w:pPr>
+      <w:r>
+        <w:t>If a line requires a more complicated calculation, that calculation is performed in another tax form or a worksheet, and the current form simply says to get the value from that form. Worksheets are implemented using the same simple design, that is, a series of lines that pe</w:t>
+      </w:r>
+      <w:r>
+        <w:t xml:space="preserve">rform individual </w:t>
+      </w:r>
+      <w:r>
+        <w:t>steps in a larger calculation.</w:t>
+      </w:r>
+    </w:p>
+    <w:p>
+      <w:pPr>
+        <w:pStyle w:val="Body-Text"/>
+      </w:pPr>
+      <w:r>
+        <w:t>T</w:t>
+      </w:r>
+      <w:r>
+        <w:t xml:space="preserve">his design </w:t>
+      </w:r>
+      <w:r>
+        <w:t xml:space="preserve">is </w:t>
+      </w:r>
+      <w:r>
+        <w:t>also highly flexibl</w:t>
+      </w:r>
+      <w:r>
+        <w:t>e</w:t>
+      </w:r>
+      <w:r>
+        <w:t xml:space="preserve"> and extensible.</w:t>
+      </w:r>
+      <w:r>
+        <w:t xml:space="preserve"> </w:t>
+      </w:r>
+      <w:r>
+        <w:t>There are probably hundreds of tax forms, but o</w:t>
+      </w:r>
+      <w:r>
+        <w:t>nly the tax forms that you intend to use need t</w:t>
+      </w:r>
+      <w:r>
+        <w:t>o</w:t>
+      </w:r>
+      <w:r>
+        <w:t xml:space="preserve"> be implemented. If a tax form references a value in another form that has not been implemented, it gets a value of 0. If at some point in the future that form is implemented, its value will automatically start to be used.</w:t>
+      </w:r>
+    </w:p>
+    <w:p>
+      <w:pPr>
+        <w:pStyle w:val="Body-Text"/>
+      </w:pPr>
+      <w:r>
+        <w:lastRenderedPageBreak/>
+        <w:t xml:space="preserve">The calculation is automatic in another way as well. A form </w:t>
+      </w:r>
+      <w:r>
+        <w:t>will not be</w:t>
+      </w:r>
+      <w:r>
+        <w:t xml:space="preserve"> calculated until the first time it referenced. The only time this is a problem is with form 1040, which references other forms and some other forms reference information on form 1040. However, if form 1040 is calculated first, then the circular dependencies are not a problem.</w:t>
+      </w:r>
+    </w:p>
+    <w:p>
+      <w:pPr>
+        <w:pStyle w:val="Body-Text"/>
+      </w:pPr>
+    </w:p>
+    <w:p>
+      <w:pPr>
+        <w:pStyle w:val="Body-Text"/>
+      </w:pPr>
+      <w:r>
+        <w:t>Each step calculates the next intermediate value until the last line where the final result is determined. The steps are calculated in order from the first to the last. The calculation may use values from previous steps or get values from other forms.</w:t>
+      </w:r>
+    </w:p>
+    <w:p>
+      <w:pPr>
+        <w:pStyle w:val="Body-Text"/>
+      </w:pPr>
+      <w:r>
+        <w:t xml:space="preserve">This simple, consistent design allows all tax forms to be </w:t>
+      </w:r>
+      <w:r>
+        <w:t xml:space="preserve">implemented </w:t>
+      </w:r>
+      <w:r>
+        <w:t>in a similar manner. Only the implementation of the individual steps changes from one form to the</w:t>
+      </w:r>
+      <w:r>
+        <w:t xml:space="preserve"> next. Thus</w:t>
+      </w:r>
+      <w:r>
+        <w:t>,</w:t>
+      </w:r>
+      <w:r>
+        <w:t xml:space="preserve"> creating tax forms with initial tax information, executing the steps of the form, and</w:t>
       </w:r>
       <w:r>
         <w:t xml:space="preserve">, and reading </w:t>
@@ -1797,7 +1970,6 @@
         <w:spacing w:after="0"/>
       </w:pPr>
       <w:r>
-        <w:lastRenderedPageBreak/>
         <w:t>Final calculations may indicate transferring the result to another form.</w:t>
       </w:r>
     </w:p>
@@ -2044,6 +2216,7 @@
       </w:pPr>
       <w:proofErr w:type="gramStart"/>
       <w:r>
+        <w:lastRenderedPageBreak/>
         <w:t>const</w:t>
       </w:r>
       <w:proofErr w:type="gramEnd"/>
@@ -2208,7 +2381,6 @@
         <w:pStyle w:val="Body-Text"/>
       </w:pPr>
       <w:r>
-        <w:lastRenderedPageBreak/>
         <w:t>After all the information is collected into values to be entered on lines in a tax form, the tax forms are created. When the tax form is created additional checking may be performed</w:t>
       </w:r>
       <w:r>
@@ -2900,6 +3072,7 @@
         </w:tabs>
       </w:pPr>
       <w:r>
+        <w:lastRenderedPageBreak/>
         <w:t>F1099DIV</w:t>
       </w:r>
       <w:r>
@@ -3375,7 +3548,6 @@
         </w:tabs>
       </w:pPr>
       <w:r>
-        <w:lastRenderedPageBreak/>
         <w:t>F7206</w:t>
       </w:r>
       <w:r>
@@ -3755,6 +3927,7 @@
         <w:pStyle w:val="Body-Text"/>
       </w:pPr>
       <w:r>
+        <w:lastRenderedPageBreak/>
         <w:t>Debug.js</w:t>
       </w:r>
     </w:p>
@@ -3858,7 +4031,6 @@
       </w:pPr>
       <w:proofErr w:type="spellStart"/>
       <w:r>
-        <w:lastRenderedPageBreak/>
         <w:t>SalesTax</w:t>
       </w:r>
       <w:proofErr w:type="spellEnd"/>
@@ -4263,6 +4435,7 @@
         </w:numPr>
       </w:pPr>
       <w:r>
+        <w:lastRenderedPageBreak/>
         <w:t>Forms are dependent on the tax year, so must be able to switch dynamically.</w:t>
       </w:r>
     </w:p>
@@ -4382,7 +4555,6 @@
       </w:pPr>
       <w:bookmarkStart w:id="10" w:name="_Toc235223968"/>
       <w:r>
-        <w:lastRenderedPageBreak/>
         <w:t>Properties</w:t>
       </w:r>
       <w:bookmarkEnd w:id="10"/>
@@ -4647,6 +4819,7 @@
         </w:numPr>
       </w:pPr>
       <w:r>
+        <w:lastRenderedPageBreak/>
         <w:t>Get desired information from the forms</w:t>
       </w:r>
     </w:p>
@@ -4755,243 +4928,243 @@
         <w:pStyle w:val="List-Bullet025"/>
       </w:pPr>
       <w:r>
+        <w:t>1040sc</w:t>
+      </w:r>
+    </w:p>
+    <w:p>
+      <w:pPr>
+        <w:pStyle w:val="List-Bullet025"/>
+      </w:pPr>
+      <w:r>
+        <w:t>1040sd</w:t>
+      </w:r>
+    </w:p>
+    <w:p>
+      <w:pPr>
+        <w:pStyle w:val="Heading2"/>
+      </w:pPr>
+      <w:bookmarkStart w:id="16" w:name="_Toc235223974"/>
+      <w:r>
+        <w:t>Worksheets</w:t>
+      </w:r>
+      <w:bookmarkEnd w:id="16"/>
+    </w:p>
+    <w:p>
+      <w:pPr>
+        <w:pStyle w:val="List-Bullet025"/>
+      </w:pPr>
+      <w:proofErr w:type="spellStart"/>
+      <w:r>
+        <w:t>IncTax</w:t>
+      </w:r>
+      <w:proofErr w:type="spellEnd"/>
+    </w:p>
+    <w:p>
+      <w:pPr>
+        <w:pStyle w:val="List-Bullet025"/>
+      </w:pPr>
+      <w:proofErr w:type="spellStart"/>
+      <w:r>
+        <w:t>SSTax</w:t>
+      </w:r>
+      <w:proofErr w:type="spellEnd"/>
+    </w:p>
+    <w:p>
+      <w:pPr>
+        <w:pStyle w:val="List-Bullet025"/>
+      </w:pPr>
+      <w:proofErr w:type="spellStart"/>
+      <w:r>
+        <w:t>SETax</w:t>
+      </w:r>
+      <w:proofErr w:type="spellEnd"/>
+    </w:p>
+    <w:p>
+      <w:pPr>
+        <w:pStyle w:val="List-Bullet025"/>
+      </w:pPr>
+      <w:proofErr w:type="spellStart"/>
+      <w:r>
+        <w:t>TaxRefund</w:t>
+      </w:r>
+      <w:proofErr w:type="spellEnd"/>
+    </w:p>
+    <w:p>
+      <w:pPr>
+        <w:pStyle w:val="Heading2"/>
+      </w:pPr>
+      <w:bookmarkStart w:id="17" w:name="_Toc235223975"/>
+      <w:r>
+        <w:t>Forms</w:t>
+      </w:r>
+      <w:bookmarkEnd w:id="17"/>
+    </w:p>
+    <w:p>
+      <w:pPr>
+        <w:pStyle w:val="List-Bullet025"/>
+      </w:pPr>
+      <w:r>
+        <w:t>W2</w:t>
+      </w:r>
+    </w:p>
+    <w:p>
+      <w:pPr>
+        <w:pStyle w:val="List-Bullet025"/>
+      </w:pPr>
+      <w:r>
+        <w:t>1099Misc</w:t>
+      </w:r>
+    </w:p>
+    <w:p>
+      <w:pPr>
+        <w:pStyle w:val="List-Bullet025"/>
+      </w:pPr>
+      <w:r>
+        <w:t>1099NEC</w:t>
+      </w:r>
+    </w:p>
+    <w:p>
+      <w:pPr>
+        <w:pStyle w:val="Heading1"/>
+      </w:pPr>
+      <w:bookmarkStart w:id="18" w:name="_Toc235223976"/>
+      <w:r>
+        <w:t>Taxpayer Object</w:t>
+      </w:r>
+      <w:bookmarkEnd w:id="18"/>
+    </w:p>
+    <w:p>
+      <w:pPr>
+        <w:pStyle w:val="Body-Text"/>
+      </w:pPr>
+      <w:r>
+        <w:t>A taxpayer object contains global information (global, static object).</w:t>
+      </w:r>
+    </w:p>
+    <w:p>
+      <w:pPr>
+        <w:pStyle w:val="List-Bullet025"/>
+      </w:pPr>
+      <w:r>
+        <w:t>Tax year</w:t>
+      </w:r>
+      <w:r>
+        <w:t>:</w:t>
+      </w:r>
+      <w:r>
+        <w:tab/>
+        <w:t>Enumeration</w:t>
+      </w:r>
+    </w:p>
+    <w:p>
+      <w:pPr>
+        <w:pStyle w:val="List-Bullet025"/>
+      </w:pPr>
+      <w:r>
+        <w:t>Filing status</w:t>
+      </w:r>
+      <w:r>
+        <w:t>:</w:t>
+      </w:r>
+      <w:r>
+        <w:tab/>
+        <w:t>Enumeration</w:t>
+      </w:r>
+    </w:p>
+    <w:p>
+      <w:pPr>
+        <w:pStyle w:val="List-Bullet025"/>
+      </w:pPr>
+      <w:r>
+        <w:t>Taxpayer</w:t>
+      </w:r>
+      <w:r>
+        <w:t>:</w:t>
+      </w:r>
+      <w:r>
+        <w:tab/>
+        <w:t>Person</w:t>
+      </w:r>
+    </w:p>
+    <w:p>
+      <w:pPr>
+        <w:pStyle w:val="List-Bullet025"/>
+      </w:pPr>
+      <w:r>
+        <w:t>Spouse:</w:t>
+      </w:r>
+      <w:r>
+        <w:tab/>
+      </w:r>
+      <w:r>
+        <w:tab/>
+        <w:t>Person</w:t>
+      </w:r>
+    </w:p>
+    <w:p>
+      <w:pPr>
+        <w:pStyle w:val="List-Bullet025"/>
+      </w:pPr>
+      <w:r>
+        <w:t>D</w:t>
+      </w:r>
+      <w:r>
+        <w:t>ependent</w:t>
+      </w:r>
+      <w:r>
+        <w:t>:</w:t>
+      </w:r>
+      <w:r>
+        <w:tab/>
+        <w:t>Person[]</w:t>
+      </w:r>
+    </w:p>
+    <w:p>
+      <w:pPr>
+        <w:pStyle w:val="List-Bullet025"/>
+      </w:pPr>
+      <w:r>
+        <w:t>1040:</w:t>
+      </w:r>
+      <w:r>
+        <w:tab/>
+      </w:r>
+      <w:r>
+        <w:tab/>
+        <w:t>Form</w:t>
+      </w:r>
+    </w:p>
+    <w:p>
+      <w:pPr>
+        <w:pStyle w:val="Heading1"/>
+      </w:pPr>
+      <w:bookmarkStart w:id="19" w:name="_Toc235223977"/>
+      <w:r>
+        <w:t>Person Object</w:t>
+      </w:r>
+      <w:bookmarkEnd w:id="19"/>
+    </w:p>
+    <w:p>
+      <w:pPr>
+        <w:pStyle w:val="List-Bullet025"/>
+      </w:pPr>
+      <w:r>
+        <w:t>Name:</w:t>
+      </w:r>
+      <w:r>
+        <w:tab/>
+      </w:r>
+      <w:r>
+        <w:tab/>
+        <w:t>Name</w:t>
+      </w:r>
+    </w:p>
+    <w:p>
+      <w:pPr>
+        <w:pStyle w:val="List-Bullet025"/>
+      </w:pPr>
+      <w:r>
         <w:lastRenderedPageBreak/>
-        <w:t>1040sc</w:t>
-      </w:r>
-    </w:p>
-    <w:p>
-      <w:pPr>
-        <w:pStyle w:val="List-Bullet025"/>
-      </w:pPr>
-      <w:r>
-        <w:t>1040sd</w:t>
-      </w:r>
-    </w:p>
-    <w:p>
-      <w:pPr>
-        <w:pStyle w:val="Heading2"/>
-      </w:pPr>
-      <w:bookmarkStart w:id="16" w:name="_Toc235223974"/>
-      <w:r>
-        <w:t>Worksheets</w:t>
-      </w:r>
-      <w:bookmarkEnd w:id="16"/>
-    </w:p>
-    <w:p>
-      <w:pPr>
-        <w:pStyle w:val="List-Bullet025"/>
-      </w:pPr>
-      <w:proofErr w:type="spellStart"/>
-      <w:r>
-        <w:t>IncTax</w:t>
-      </w:r>
-      <w:proofErr w:type="spellEnd"/>
-    </w:p>
-    <w:p>
-      <w:pPr>
-        <w:pStyle w:val="List-Bullet025"/>
-      </w:pPr>
-      <w:proofErr w:type="spellStart"/>
-      <w:r>
-        <w:t>SSTax</w:t>
-      </w:r>
-      <w:proofErr w:type="spellEnd"/>
-    </w:p>
-    <w:p>
-      <w:pPr>
-        <w:pStyle w:val="List-Bullet025"/>
-      </w:pPr>
-      <w:proofErr w:type="spellStart"/>
-      <w:r>
-        <w:t>SETax</w:t>
-      </w:r>
-      <w:proofErr w:type="spellEnd"/>
-    </w:p>
-    <w:p>
-      <w:pPr>
-        <w:pStyle w:val="List-Bullet025"/>
-      </w:pPr>
-      <w:proofErr w:type="spellStart"/>
-      <w:r>
-        <w:t>TaxRefund</w:t>
-      </w:r>
-      <w:proofErr w:type="spellEnd"/>
-    </w:p>
-    <w:p>
-      <w:pPr>
-        <w:pStyle w:val="Heading2"/>
-      </w:pPr>
-      <w:bookmarkStart w:id="17" w:name="_Toc235223975"/>
-      <w:r>
-        <w:t>Forms</w:t>
-      </w:r>
-      <w:bookmarkEnd w:id="17"/>
-    </w:p>
-    <w:p>
-      <w:pPr>
-        <w:pStyle w:val="List-Bullet025"/>
-      </w:pPr>
-      <w:r>
-        <w:t>W2</w:t>
-      </w:r>
-    </w:p>
-    <w:p>
-      <w:pPr>
-        <w:pStyle w:val="List-Bullet025"/>
-      </w:pPr>
-      <w:r>
-        <w:t>1099Misc</w:t>
-      </w:r>
-    </w:p>
-    <w:p>
-      <w:pPr>
-        <w:pStyle w:val="List-Bullet025"/>
-      </w:pPr>
-      <w:r>
-        <w:t>1099NEC</w:t>
-      </w:r>
-    </w:p>
-    <w:p>
-      <w:pPr>
-        <w:pStyle w:val="Heading1"/>
-      </w:pPr>
-      <w:bookmarkStart w:id="18" w:name="_Toc235223976"/>
-      <w:r>
-        <w:t>Taxpayer Object</w:t>
-      </w:r>
-      <w:bookmarkEnd w:id="18"/>
-    </w:p>
-    <w:p>
-      <w:pPr>
-        <w:pStyle w:val="Body-Text"/>
-      </w:pPr>
-      <w:r>
-        <w:t>A taxpayer object contains global information (global, static object).</w:t>
-      </w:r>
-    </w:p>
-    <w:p>
-      <w:pPr>
-        <w:pStyle w:val="List-Bullet025"/>
-      </w:pPr>
-      <w:r>
-        <w:t>Tax year</w:t>
-      </w:r>
-      <w:r>
-        <w:t>:</w:t>
-      </w:r>
-      <w:r>
-        <w:tab/>
-        <w:t>Enumeration</w:t>
-      </w:r>
-    </w:p>
-    <w:p>
-      <w:pPr>
-        <w:pStyle w:val="List-Bullet025"/>
-      </w:pPr>
-      <w:r>
-        <w:t>Filing status</w:t>
-      </w:r>
-      <w:r>
-        <w:t>:</w:t>
-      </w:r>
-      <w:r>
-        <w:tab/>
-        <w:t>Enumeration</w:t>
-      </w:r>
-    </w:p>
-    <w:p>
-      <w:pPr>
-        <w:pStyle w:val="List-Bullet025"/>
-      </w:pPr>
-      <w:r>
-        <w:t>Taxpayer</w:t>
-      </w:r>
-      <w:r>
-        <w:t>:</w:t>
-      </w:r>
-      <w:r>
-        <w:tab/>
-        <w:t>Person</w:t>
-      </w:r>
-    </w:p>
-    <w:p>
-      <w:pPr>
-        <w:pStyle w:val="List-Bullet025"/>
-      </w:pPr>
-      <w:r>
-        <w:t>Spouse:</w:t>
-      </w:r>
-      <w:r>
-        <w:tab/>
-      </w:r>
-      <w:r>
-        <w:tab/>
-        <w:t>Person</w:t>
-      </w:r>
-    </w:p>
-    <w:p>
-      <w:pPr>
-        <w:pStyle w:val="List-Bullet025"/>
-      </w:pPr>
-      <w:r>
-        <w:t>D</w:t>
-      </w:r>
-      <w:r>
-        <w:t>ependent</w:t>
-      </w:r>
-      <w:r>
-        <w:t>:</w:t>
-      </w:r>
-      <w:r>
-        <w:tab/>
-        <w:t>Person[]</w:t>
-      </w:r>
-    </w:p>
-    <w:p>
-      <w:pPr>
-        <w:pStyle w:val="List-Bullet025"/>
-      </w:pPr>
-      <w:r>
-        <w:t>1040:</w:t>
-      </w:r>
-      <w:r>
-        <w:tab/>
-      </w:r>
-      <w:r>
-        <w:tab/>
-        <w:t>Form</w:t>
-      </w:r>
-    </w:p>
-    <w:p>
-      <w:pPr>
-        <w:pStyle w:val="Heading1"/>
-      </w:pPr>
-      <w:bookmarkStart w:id="19" w:name="_Toc235223977"/>
-      <w:r>
-        <w:t>Person Object</w:t>
-      </w:r>
-      <w:bookmarkEnd w:id="19"/>
-    </w:p>
-    <w:p>
-      <w:pPr>
-        <w:pStyle w:val="List-Bullet025"/>
-      </w:pPr>
-      <w:r>
-        <w:t>Name:</w:t>
-      </w:r>
-      <w:r>
-        <w:tab/>
-      </w:r>
-      <w:r>
-        <w:tab/>
-        <w:t>Name</w:t>
-      </w:r>
-    </w:p>
-    <w:p>
-      <w:pPr>
-        <w:pStyle w:val="List-Bullet025"/>
-      </w:pPr>
-      <w:r>
         <w:t>Address:</w:t>
       </w:r>
       <w:r>
@@ -5155,7 +5328,6 @@
         <w:ind w:left="1800"/>
       </w:pPr>
       <w:r>
-        <w:lastRenderedPageBreak/>
         <w:t>Inputs that can be set,</w:t>
       </w:r>
     </w:p>
@@ -5417,7 +5589,7 @@
         <w:szCs w:val="24"/>
         <w:lang w:eastAsia="en-US"/>
       </w:rPr>
-      <w:t>3</w:t>
+      <w:t>2</w:t>
     </w:r>
     <w:r>
       <w:rPr>
@@ -6287,6 +6459,119 @@
     </w:lvl>
   </w:abstractNum>
   <w:abstractNum w:abstractNumId="7">
+    <w:nsid w:val="266A701D"/>
+    <w:multiLevelType w:val="hybridMultilevel"/>
+    <w:tmpl w:val="97D8B736"/>
+    <w:lvl w:ilvl="0" w:tplc="04090001">
+      <w:start w:val="1"/>
+      <w:numFmt w:val="bullet"/>
+      <w:lvlText w:val=""/>
+      <w:lvlJc w:val="left"/>
+      <w:pPr>
+        <w:ind w:left="1440" w:hanging="360"/>
+      </w:pPr>
+      <w:rPr>
+        <w:rFonts w:ascii="Symbol" w:hAnsi="Symbol" w:hint="default"/>
+      </w:rPr>
+    </w:lvl>
+    <w:lvl w:ilvl="1" w:tplc="04090003" w:tentative="1">
+      <w:start w:val="1"/>
+      <w:numFmt w:val="bullet"/>
+      <w:lvlText w:val="o"/>
+      <w:lvlJc w:val="left"/>
+      <w:pPr>
+        <w:ind w:left="2160" w:hanging="360"/>
+      </w:pPr>
+      <w:rPr>
+        <w:rFonts w:ascii="Courier New" w:hAnsi="Courier New" w:cs="Courier New" w:hint="default"/>
+      </w:rPr>
+    </w:lvl>
+    <w:lvl w:ilvl="2" w:tplc="04090005" w:tentative="1">
+      <w:start w:val="1"/>
+      <w:numFmt w:val="bullet"/>
+      <w:lvlText w:val=""/>
+      <w:lvlJc w:val="left"/>
+      <w:pPr>
+        <w:ind w:left="2880" w:hanging="360"/>
+      </w:pPr>
+      <w:rPr>
+        <w:rFonts w:ascii="Wingdings" w:hAnsi="Wingdings" w:hint="default"/>
+      </w:rPr>
+    </w:lvl>
+    <w:lvl w:ilvl="3" w:tplc="04090001" w:tentative="1">
+      <w:start w:val="1"/>
+      <w:numFmt w:val="bullet"/>
+      <w:lvlText w:val=""/>
+      <w:lvlJc w:val="left"/>
+      <w:pPr>
+        <w:ind w:left="3600" w:hanging="360"/>
+      </w:pPr>
+      <w:rPr>
+        <w:rFonts w:ascii="Symbol" w:hAnsi="Symbol" w:hint="default"/>
+      </w:rPr>
+    </w:lvl>
+    <w:lvl w:ilvl="4" w:tplc="04090003" w:tentative="1">
+      <w:start w:val="1"/>
+      <w:numFmt w:val="bullet"/>
+      <w:lvlText w:val="o"/>
+      <w:lvlJc w:val="left"/>
+      <w:pPr>
+        <w:ind w:left="4320" w:hanging="360"/>
+      </w:pPr>
+      <w:rPr>
+        <w:rFonts w:ascii="Courier New" w:hAnsi="Courier New" w:cs="Courier New" w:hint="default"/>
+      </w:rPr>
+    </w:lvl>
+    <w:lvl w:ilvl="5" w:tplc="04090005" w:tentative="1">
+      <w:start w:val="1"/>
+      <w:numFmt w:val="bullet"/>
+      <w:lvlText w:val=""/>
+      <w:lvlJc w:val="left"/>
+      <w:pPr>
+        <w:ind w:left="5040" w:hanging="360"/>
+      </w:pPr>
+      <w:rPr>
+        <w:rFonts w:ascii="Wingdings" w:hAnsi="Wingdings" w:hint="default"/>
+      </w:rPr>
+    </w:lvl>
+    <w:lvl w:ilvl="6" w:tplc="04090001" w:tentative="1">
+      <w:start w:val="1"/>
+      <w:numFmt w:val="bullet"/>
+      <w:lvlText w:val=""/>
+      <w:lvlJc w:val="left"/>
+      <w:pPr>
+        <w:ind w:left="5760" w:hanging="360"/>
+      </w:pPr>
+      <w:rPr>
+        <w:rFonts w:ascii="Symbol" w:hAnsi="Symbol" w:hint="default"/>
+      </w:rPr>
+    </w:lvl>
+    <w:lvl w:ilvl="7" w:tplc="04090003" w:tentative="1">
+      <w:start w:val="1"/>
+      <w:numFmt w:val="bullet"/>
+      <w:lvlText w:val="o"/>
+      <w:lvlJc w:val="left"/>
+      <w:pPr>
+        <w:ind w:left="6480" w:hanging="360"/>
+      </w:pPr>
+      <w:rPr>
+        <w:rFonts w:ascii="Courier New" w:hAnsi="Courier New" w:cs="Courier New" w:hint="default"/>
+      </w:rPr>
+    </w:lvl>
+    <w:lvl w:ilvl="8" w:tplc="04090005" w:tentative="1">
+      <w:start w:val="1"/>
+      <w:numFmt w:val="bullet"/>
+      <w:lvlText w:val=""/>
+      <w:lvlJc w:val="left"/>
+      <w:pPr>
+        <w:ind w:left="7200" w:hanging="360"/>
+      </w:pPr>
+      <w:rPr>
+        <w:rFonts w:ascii="Wingdings" w:hAnsi="Wingdings" w:hint="default"/>
+      </w:rPr>
+    </w:lvl>
+  </w:abstractNum>
+  <w:abstractNum w:abstractNumId="8">
     <w:nsid w:val="2F6D352C"/>
     <w:multiLevelType w:val="hybridMultilevel"/>
     <w:tmpl w:val="4A6A32C2"/>
@@ -6399,7 +6684,7 @@
       </w:rPr>
     </w:lvl>
   </w:abstractNum>
-  <w:abstractNum w:abstractNumId="8">
+  <w:abstractNum w:abstractNumId="9">
     <w:nsid w:val="34253A7A"/>
     <w:multiLevelType w:val="hybridMultilevel"/>
     <w:tmpl w:val="532AC612"/>
@@ -6485,7 +6770,7 @@
       </w:pPr>
     </w:lvl>
   </w:abstractNum>
-  <w:abstractNum w:abstractNumId="9">
+  <w:abstractNum w:abstractNumId="10">
     <w:nsid w:val="37F73326"/>
     <w:multiLevelType w:val="hybridMultilevel"/>
     <w:tmpl w:val="D6809194"/>
@@ -6598,7 +6883,7 @@
       </w:rPr>
     </w:lvl>
   </w:abstractNum>
-  <w:abstractNum w:abstractNumId="10">
+  <w:abstractNum w:abstractNumId="11">
     <w:nsid w:val="3D3B424D"/>
     <w:multiLevelType w:val="hybridMultilevel"/>
     <w:tmpl w:val="3D24DA78"/>
@@ -6712,7 +6997,7 @@
       </w:rPr>
     </w:lvl>
   </w:abstractNum>
-  <w:abstractNum w:abstractNumId="11">
+  <w:abstractNum w:abstractNumId="12">
     <w:nsid w:val="41936094"/>
     <w:multiLevelType w:val="hybridMultilevel"/>
     <w:tmpl w:val="D0107CD2"/>
@@ -6826,7 +7111,7 @@
       </w:rPr>
     </w:lvl>
   </w:abstractNum>
-  <w:abstractNum w:abstractNumId="12">
+  <w:abstractNum w:abstractNumId="13">
     <w:nsid w:val="45145E4D"/>
     <w:multiLevelType w:val="hybridMultilevel"/>
     <w:tmpl w:val="7696BC50"/>
@@ -6940,7 +7225,7 @@
       </w:rPr>
     </w:lvl>
   </w:abstractNum>
-  <w:abstractNum w:abstractNumId="13">
+  <w:abstractNum w:abstractNumId="14">
     <w:nsid w:val="53AC291B"/>
     <w:multiLevelType w:val="hybridMultilevel"/>
     <w:tmpl w:val="73DAF080"/>
@@ -7053,7 +7338,7 @@
       </w:rPr>
     </w:lvl>
   </w:abstractNum>
-  <w:abstractNum w:abstractNumId="14">
+  <w:abstractNum w:abstractNumId="15">
     <w:nsid w:val="5C90481A"/>
     <w:multiLevelType w:val="hybridMultilevel"/>
     <w:tmpl w:val="9FDAE886"/>
@@ -7166,7 +7451,7 @@
       </w:rPr>
     </w:lvl>
   </w:abstractNum>
-  <w:abstractNum w:abstractNumId="15">
+  <w:abstractNum w:abstractNumId="16">
     <w:nsid w:val="6A06332F"/>
     <w:multiLevelType w:val="hybridMultilevel"/>
     <w:tmpl w:val="7E7CD2AC"/>
@@ -7280,76 +7565,76 @@
     </w:lvl>
   </w:abstractNum>
   <w:num w:numId="1">
-    <w:abstractNumId w:val="10"/>
+    <w:abstractNumId w:val="11"/>
   </w:num>
   <w:num w:numId="2">
-    <w:abstractNumId w:val="11"/>
+    <w:abstractNumId w:val="12"/>
   </w:num>
   <w:num w:numId="3">
     <w:abstractNumId w:val="4"/>
   </w:num>
   <w:num w:numId="4">
-    <w:abstractNumId w:val="12"/>
+    <w:abstractNumId w:val="13"/>
   </w:num>
   <w:num w:numId="5">
     <w:abstractNumId w:val="1"/>
   </w:num>
   <w:num w:numId="6">
-    <w:abstractNumId w:val="9"/>
+    <w:abstractNumId w:val="10"/>
   </w:num>
   <w:num w:numId="7">
     <w:abstractNumId w:val="6"/>
   </w:num>
   <w:num w:numId="8">
-    <w:abstractNumId w:val="7"/>
+    <w:abstractNumId w:val="8"/>
   </w:num>
   <w:num w:numId="9">
-    <w:abstractNumId w:val="10"/>
+    <w:abstractNumId w:val="11"/>
   </w:num>
   <w:num w:numId="10">
-    <w:abstractNumId w:val="10"/>
+    <w:abstractNumId w:val="11"/>
   </w:num>
   <w:num w:numId="11">
-    <w:abstractNumId w:val="12"/>
+    <w:abstractNumId w:val="13"/>
   </w:num>
   <w:num w:numId="12">
-    <w:abstractNumId w:val="12"/>
+    <w:abstractNumId w:val="13"/>
   </w:num>
   <w:num w:numId="13">
-    <w:abstractNumId w:val="12"/>
+    <w:abstractNumId w:val="13"/>
   </w:num>
   <w:num w:numId="14">
-    <w:abstractNumId w:val="12"/>
+    <w:abstractNumId w:val="13"/>
   </w:num>
   <w:num w:numId="15">
-    <w:abstractNumId w:val="12"/>
+    <w:abstractNumId w:val="13"/>
   </w:num>
   <w:num w:numId="16">
-    <w:abstractNumId w:val="12"/>
+    <w:abstractNumId w:val="13"/>
   </w:num>
   <w:num w:numId="17">
-    <w:abstractNumId w:val="12"/>
+    <w:abstractNumId w:val="13"/>
   </w:num>
   <w:num w:numId="18">
-    <w:abstractNumId w:val="12"/>
+    <w:abstractNumId w:val="13"/>
   </w:num>
   <w:num w:numId="19">
-    <w:abstractNumId w:val="12"/>
+    <w:abstractNumId w:val="13"/>
   </w:num>
   <w:num w:numId="20">
-    <w:abstractNumId w:val="10"/>
+    <w:abstractNumId w:val="11"/>
   </w:num>
   <w:num w:numId="21">
-    <w:abstractNumId w:val="10"/>
+    <w:abstractNumId w:val="11"/>
   </w:num>
   <w:num w:numId="22">
-    <w:abstractNumId w:val="12"/>
+    <w:abstractNumId w:val="13"/>
   </w:num>
   <w:num w:numId="23">
-    <w:abstractNumId w:val="12"/>
+    <w:abstractNumId w:val="13"/>
   </w:num>
   <w:num w:numId="24">
-    <w:abstractNumId w:val="13"/>
+    <w:abstractNumId w:val="14"/>
   </w:num>
   <w:num w:numId="25">
     <w:abstractNumId w:val="2"/>
@@ -7358,19 +7643,22 @@
     <w:abstractNumId w:val="0"/>
   </w:num>
   <w:num w:numId="27">
-    <w:abstractNumId w:val="14"/>
+    <w:abstractNumId w:val="15"/>
   </w:num>
   <w:num w:numId="28">
     <w:abstractNumId w:val="3"/>
   </w:num>
   <w:num w:numId="29">
-    <w:abstractNumId w:val="15"/>
+    <w:abstractNumId w:val="16"/>
   </w:num>
   <w:num w:numId="30">
-    <w:abstractNumId w:val="8"/>
+    <w:abstractNumId w:val="9"/>
   </w:num>
   <w:num w:numId="31">
     <w:abstractNumId w:val="5"/>
+  </w:num>
+  <w:num w:numId="32">
+    <w:abstractNumId w:val="7"/>
   </w:num>
   <w:numIdMacAtCleanup w:val="4"/>
 </w:numbering>
@@ -8743,7 +9031,7 @@
 </file>
 
 <file path=customXml/itemProps1.xml><?xml version="1.0" encoding="utf-8"?>
-<ds:datastoreItem xmlns:ds="http://schemas.openxmlformats.org/officeDocument/2006/customXml" ds:itemID="{CC26C25A-7685-4AE2-B334-26E2785C4CDD}">
+<ds:datastoreItem xmlns:ds="http://schemas.openxmlformats.org/officeDocument/2006/customXml" ds:itemID="{F3417C75-001F-4EBC-B572-8E10ADB6EE07}">
   <ds:schemaRefs>
     <ds:schemaRef ds:uri="http://schemas.openxmlformats.org/officeDocument/2006/bibliography"/>
   </ds:schemaRefs>

</xml_diff>

<commit_message>
Cleanup changes for TaxProgram.
</commit_message>
<xml_diff>
--- a/Documentation/Design.docx
+++ b/Documentation/Design.docx
@@ -39,7 +39,7 @@
           <w:rPr>
             <w:noProof/>
           </w:rPr>
-          <w:t>August 8, 2026</w:t>
+          <w:t>August 9, 2026</w:t>
         </w:r>
       </w:fldSimple>
     </w:p>
@@ -2120,7 +2120,35 @@
         <w:rPr>
           <w:lang w:eastAsia="ar-SA"/>
         </w:rPr>
-        <w:t>This is a static method. Each tax form contains a copy of the HTML code that can be used to display the tax form on a web page. All of the fields on the form will contain their initial values. Typically this is zero or blank, possibly with a placeholder value (a grayed out value, with a demonstration value).</w:t>
+        <w:t xml:space="preserve">This is a static method used to create the form on a web page without an object. If an object exists for the form, you can use the </w:t>
+      </w:r>
+      <w:proofErr w:type="spellStart"/>
+      <w:proofErr w:type="gramStart"/>
+      <w:r>
+        <w:rPr>
+          <w:rStyle w:val="SourceCodechar"/>
+        </w:rPr>
+        <w:t>toHTML</w:t>
+      </w:r>
+      <w:proofErr w:type="spellEnd"/>
+      <w:r>
+        <w:rPr>
+          <w:rStyle w:val="SourceCodechar"/>
+        </w:rPr>
+        <w:t>(</w:t>
+      </w:r>
+      <w:proofErr w:type="gramEnd"/>
+      <w:r>
+        <w:rPr>
+          <w:rStyle w:val="SourceCodechar"/>
+        </w:rPr>
+        <w:t>)</w:t>
+      </w:r>
+      <w:r>
+        <w:rPr>
+          <w:lang w:eastAsia="ar-SA"/>
+        </w:rPr>
+        <w:t xml:space="preserve"> method to create a web page from the form.</w:t>
       </w:r>
     </w:p>
     <w:p>
@@ -2134,12 +2162,56 @@
         <w:rPr>
           <w:lang w:eastAsia="ar-SA"/>
         </w:rPr>
-        <w:t>The value field for each line of the tax form will have an ID assigned to it. The id will be the form name, and the line number separated by a hyphen. Forms that can be entered multiple times will also have an index to indicate which instance of the for</w:t>
+        <w:t>Many tax</w:t>
       </w:r>
       <w:r>
         <w:rPr>
           <w:lang w:eastAsia="ar-SA"/>
         </w:rPr>
+        <w:t xml:space="preserve"> form</w:t>
+      </w:r>
+      <w:r>
+        <w:rPr>
+          <w:lang w:eastAsia="ar-SA"/>
+        </w:rPr>
+        <w:t>s contain</w:t>
+      </w:r>
+      <w:r>
+        <w:rPr>
+          <w:lang w:eastAsia="ar-SA"/>
+        </w:rPr>
+        <w:t xml:space="preserve"> a copy of the HTML code that can be used to display the tax form on a web page. All of the fields on the form will contain their initial values. Typically this is zero or blank, possibly with a placeholder value (a grayed out value, with a demonstration value).</w:t>
+      </w:r>
+    </w:p>
+    <w:p>
+      <w:pPr>
+        <w:pStyle w:val="Body-Text"/>
+        <w:rPr>
+          <w:lang w:eastAsia="ar-SA"/>
+        </w:rPr>
+      </w:pPr>
+      <w:r>
+        <w:rPr>
+          <w:lang w:eastAsia="ar-SA"/>
+        </w:rPr>
+        <w:t xml:space="preserve">The value field for each line of the tax form will have an ID assigned to it. The </w:t>
+      </w:r>
+      <w:r>
+        <w:rPr>
+          <w:lang w:eastAsia="ar-SA"/>
+        </w:rPr>
+        <w:t>ID</w:t>
+      </w:r>
+      <w:r>
+        <w:rPr>
+          <w:lang w:eastAsia="ar-SA"/>
+        </w:rPr>
+        <w:t xml:space="preserve"> will be the form name, and the line number separated by a hyphen. Forms that can be entered multiple times will also have an index to indicate which instance of the for</w:t>
+      </w:r>
+      <w:r>
+        <w:rPr>
+          <w:lang w:eastAsia="ar-SA"/>
+        </w:rPr>
         <w:t>m</w:t>
       </w:r>
       <w:r>
@@ -2161,6 +2233,7 @@
       </w:pPr>
       <w:proofErr w:type="gramStart"/>
       <w:r>
+        <w:lastRenderedPageBreak/>
         <w:t>static</w:t>
       </w:r>
       <w:proofErr w:type="gramEnd"/>
@@ -2196,14 +2269,7 @@
         <w:rPr>
           <w:lang w:eastAsia="ar-SA"/>
         </w:rPr>
-        <w:t xml:space="preserve"> For each line on the tax form, this method will read the value of the line from the web page. As mentioned above, the tax form line number corresponding to each field is embedded in the ID </w:t>
-      </w:r>
-      <w:r>
-        <w:rPr>
-          <w:lang w:eastAsia="ar-SA"/>
-        </w:rPr>
-        <w:lastRenderedPageBreak/>
-        <w:t>assigned to that field.</w:t>
+        <w:t xml:space="preserve"> For each line on the tax form, this method will read the value of the line from the web page. As mentioned above, the tax form line number corresponding to each field is embedded in the ID assigned to that field.</w:t>
       </w:r>
       <w:r>
         <w:rPr>
@@ -2639,7 +2705,11 @@
         <w:t xml:space="preserve"> this implementation allows the taxpayer to override any field in any tax forms.</w:t>
       </w:r>
       <w:r>
-        <w:t xml:space="preserve"> If the user does not want the value to be overridden, they can simply not enter the information and the tax form will calculated the value based on the other information that is available.</w:t>
+        <w:t xml:space="preserve"> If the user does not want the value to be </w:t>
+      </w:r>
+      <w:r>
+        <w:lastRenderedPageBreak/>
+        <w:t>overridden, they can simply not enter the information and the tax form will calculated the value based on the other information that is available.</w:t>
       </w:r>
     </w:p>
     <w:p>
@@ -2648,7 +2718,6 @@
       </w:pPr>
       <w:bookmarkStart w:id="7" w:name="_Toc237166486"/>
       <w:r>
-        <w:lastRenderedPageBreak/>
         <w:t>Supporting Code</w:t>
       </w:r>
       <w:bookmarkEnd w:id="7"/>
@@ -3264,6 +3333,7 @@
       </w:pPr>
       <w:bookmarkStart w:id="8" w:name="_Toc237166487"/>
       <w:r>
+        <w:lastRenderedPageBreak/>
         <w:t>Conventions</w:t>
       </w:r>
       <w:bookmarkEnd w:id="8"/>
@@ -3368,7 +3438,6 @@
         </w:numPr>
       </w:pPr>
       <w:r>
-        <w:lastRenderedPageBreak/>
         <w:t>Do not use var.</w:t>
       </w:r>
     </w:p>
@@ -3839,7 +3908,7 @@
         <w:szCs w:val="24"/>
         <w:lang w:eastAsia="en-US"/>
       </w:rPr>
-      <w:t>6</w:t>
+      <w:t>3</w:t>
     </w:r>
     <w:r>
       <w:rPr>
@@ -7652,7 +7721,7 @@
 </file>
 
 <file path=customXml/itemProps1.xml><?xml version="1.0" encoding="utf-8"?>
-<ds:datastoreItem xmlns:ds="http://schemas.openxmlformats.org/officeDocument/2006/customXml" ds:itemID="{0398D4E3-A109-4447-BE4A-9E33E0ED2C8D}">
+<ds:datastoreItem xmlns:ds="http://schemas.openxmlformats.org/officeDocument/2006/customXml" ds:itemID="{80D741F6-D474-4247-9C34-4D51D168AB62}">
   <ds:schemaRefs>
     <ds:schemaRef ds:uri="http://schemas.openxmlformats.org/officeDocument/2006/bibliography"/>
   </ds:schemaRefs>

</xml_diff>